<commit_message>
docs: update short abstract with black-and-white theme, author metadata, full code snippets, and diagrams
</commit_message>
<xml_diff>
--- a/NetTelemetry_Short_Abstract.docx
+++ b/NetTelemetry_Short_Abstract.docx
@@ -11,29 +11,57 @@
         <w:rPr>
           <w:rFonts w:ascii="Calibri" w:hAnsi="Calibri"/>
           <w:b/>
-          <w:color w:val="2E6B9E"/>
-          <w:sz w:val="19"/>
+          <w:color w:val="000000"/>
+          <w:sz w:val="22"/>
         </w:rPr>
-        <w:t>COMPUTER NETWORKS PROJECT ABSTRACT (SHORT VERSION)</w:t>
+        <w:t>20MSS56 – NETWORKS PROGRAMMING LABORATORY</w:t>
         <w:br/>
       </w:r>
       <w:r>
         <w:rPr>
           <w:rFonts w:ascii="Calibri" w:hAnsi="Calibri"/>
           <w:b/>
-          <w:color w:val="1B365D"/>
-          <w:sz w:val="34"/>
+          <w:color w:val="000000"/>
+          <w:sz w:val="28"/>
         </w:rPr>
-        <w:t>NetTelemetry: Real-Time Network Health Monitoring and Performance Telemetry</w:t>
+        <w:t>PROJECT ABSTRACT</w:t>
         <w:br/>
       </w:r>
       <w:r>
         <w:rPr>
           <w:rFonts w:ascii="Calibri" w:hAnsi="Calibri"/>
-          <w:color w:val="64748B"/>
-          <w:sz w:val="21"/>
+          <w:b/>
+          <w:color w:val="000000"/>
+          <w:sz w:val="32"/>
         </w:rPr>
-        <w:t>Concise Technical Abstract, Protocol Architecture, Implementation, and Evaluation</w:t>
+        <w:t>NetTelemetry: Real-Time Network Health Monitoring and Performance Telemetry</w:t>
+        <w:br/>
+      </w:r>
+    </w:p>
+    <w:p>
+      <w:pPr>
+        <w:spacing w:before="80" w:after="80"/>
+        <w:jc w:val="center"/>
+      </w:pPr>
+      <w:r>
+        <w:rPr>
+          <w:rFonts w:ascii="Calibri" w:hAnsi="Calibri"/>
+          <w:b/>
+          <w:color w:val="000000"/>
+          <w:sz w:val="20"/>
+        </w:rPr>
+        <w:t>DONE BY:</w:t>
+        <w:br/>
+      </w:r>
+      <w:r>
+        <w:rPr>
+          <w:rFonts w:ascii="Calibri" w:hAnsi="Calibri"/>
+          <w:b/>
+          <w:color w:val="000000"/>
+          <w:sz w:val="20"/>
+        </w:rPr>
+        <w:t>DHANUMITHRA T – 2403717672622011          SREE RAG S – 2403717672621050</w:t>
+        <w:br/>
       </w:r>
     </w:p>
     <w:tbl>
@@ -49,13 +77,19 @@
         <w:tc>
           <w:tcPr>
             <w:tcW w:type="dxa" w:w="9936"/>
-            <w:shd w:fill="F4F7FB"/>
+            <w:shd w:fill="FFFFFF"/>
             <w:tcMar>
-              <w:top w:w="100" w:type="dxa"/>
-              <w:bottom w:w="100" w:type="dxa"/>
-              <w:left w:w="160" w:type="dxa"/>
-              <w:right w:w="160" w:type="dxa"/>
+              <w:top w:w="80" w:type="dxa"/>
+              <w:bottom w:w="80" w:type="dxa"/>
+              <w:left w:w="140" w:type="dxa"/>
+              <w:right w:w="140" w:type="dxa"/>
             </w:tcMar>
+            <w:tcBorders>
+              <w:top w:val="single" w:sz="6" w:space="0" w:color="000000"/>
+              <w:left w:val="single" w:sz="6" w:space="0" w:color="000000"/>
+              <w:bottom w:val="single" w:sz="6" w:space="0" w:color="000000"/>
+              <w:right w:val="single" w:sz="6" w:space="0" w:color="000000"/>
+            </w:tcBorders>
           </w:tcPr>
           <w:p>
             <w:pPr>
@@ -66,10 +100,10 @@
               <w:rPr>
                 <w:rFonts w:ascii="Calibri" w:hAnsi="Calibri"/>
                 <w:b/>
-                <w:color w:val="1B365D"/>
+                <w:color w:val="000000"/>
                 <w:sz w:val="18"/>
               </w:rPr>
-              <w:t>Domain: Computer Networks  |  Protocols: ICMP, TCP, UDP, IPv4, DNS  |  Topology: Star Probing</w:t>
+              <w:t>Domain: Computer Networks  |  Protocols: ICMP, TCP, UDP, IPv4, DNS  |  Topology: Distributed Star Probing</w:t>
             </w:r>
           </w:p>
         </w:tc>
@@ -89,8 +123,8 @@
         <w:rPr>
           <w:rFonts w:ascii="Calibri" w:hAnsi="Calibri"/>
           <w:b/>
-          <w:color w:val="1B365D"/>
-          <w:sz w:val="25"/>
+          <w:color w:val="000000"/>
+          <w:sz w:val="24"/>
         </w:rPr>
         <w:t>Executive Abstract</w:t>
       </w:r>
@@ -102,10 +136,10 @@
       <w:r>
         <w:rPr>
           <w:rFonts w:ascii="Calibri" w:hAnsi="Calibri"/>
-          <w:color w:val="222222"/>
+          <w:color w:val="000000"/>
           <w:sz w:val="19"/>
         </w:rPr>
-        <w:t>In modern computer networking, simple binary reachability checks ('is the host alive?') fail to detect 'silent performance degradation' such as bufferbloat, micro-burst packet loss, delay variation (jitter), and transport connection latency spikes. NetTelemetry is an active, multi-layer network health monitoring framework that combines Layer 3 (Network Layer) control probing via native ICMP and Layer 4 (Transport Layer) connection timing via TCP/UDP sockets. It continuously audits endpoints across local gateways, public Anycast DNS (8.8.8.8, 1.1.1.1), and WAN cloud servers, computing rolling RTT, IPv4 TTL hop distance, packet loss %, availability, RFC 3550 jitter, and P95/P99 latency. An automated anomaly engine flags performance deviations against established baselines, presenting live network health through an interactive Streamlit operations dashboard. This concise report summarizes the problem, architecture, implementation, test validation, and practical networking applications of the project.</w:t>
+        <w:t>In modern computer networking, simple binary reachability checks ('is the host alive?') fail to detect 'silent performance degradation' such as bufferbloat, micro-burst packet loss, delay variation (jitter), and transport connection latency spikes. NetTelemetry is an active, multi-layer network health monitoring framework that combines Layer 3 (Network Layer) control probing via native ICMP and Layer 4 (Transport Layer) connection timing via TCP/UDP sockets. It continuously audits endpoints across local gateways, public Anycast DNS (8.8.8.8, 1.1.1.1), and WAN cloud servers, computing rolling RTT, IPv4 TTL hop distance, packet loss %, availability, RFC 3550 jitter, and P95/P99 latency. An automated anomaly engine flags performance deviations against established baselines, presenting live network health through an interactive Streamlit operations dashboard. This concise report presents the problem, architecture, implementation, complete network coding, test validation, and practical networking applications.</w:t>
       </w:r>
     </w:p>
     <w:p>
@@ -117,8 +151,8 @@
         <w:rPr>
           <w:rFonts w:ascii="Calibri" w:hAnsi="Calibri"/>
           <w:b/>
-          <w:color w:val="1B365D"/>
-          <w:sz w:val="25"/>
+          <w:color w:val="000000"/>
+          <w:sz w:val="24"/>
         </w:rPr>
         <w:t>1. Problem Identification and Objective (Relevance of Project to Computer Networks)</w:t>
       </w:r>
@@ -132,7 +166,7 @@
         <w:rPr>
           <w:rFonts w:ascii="Calibri" w:hAnsi="Calibri"/>
           <w:b/>
-          <w:color w:val="2E6B9E"/>
+          <w:color w:val="000000"/>
           <w:sz w:val="21"/>
         </w:rPr>
         <w:t>1.1 Problem Identification: Silent Network Degradation</w:t>
@@ -145,7 +179,7 @@
       <w:r>
         <w:rPr>
           <w:rFonts w:ascii="Calibri" w:hAnsi="Calibri"/>
-          <w:color w:val="222222"/>
+          <w:color w:val="000000"/>
           <w:sz w:val="19"/>
         </w:rPr>
         <w:t>A network connection can be technically established while providing unacceptable quality of service. Traditional manual tools like standard ping only show isolated samples, missing critical networking issues:</w:t>
@@ -160,7 +194,7 @@
         <w:rPr>
           <w:rFonts w:ascii="Calibri" w:hAnsi="Calibri"/>
           <w:b/>
-          <w:color w:val="1B365D"/>
+          <w:color w:val="000000"/>
           <w:sz w:val="18"/>
         </w:rPr>
         <w:t xml:space="preserve">Queueing Delay &amp; Bufferbloat: </w:t>
@@ -168,10 +202,10 @@
       <w:r>
         <w:rPr>
           <w:rFonts w:ascii="Calibri" w:hAnsi="Calibri"/>
-          <w:color w:val="222222"/>
+          <w:color w:val="000000"/>
           <w:sz w:val="18"/>
         </w:rPr>
-        <w:t>Router buffer congestion causes latency spikes (e.g. 25 ms jumping to 250 ms) without disconnecting the link.</w:t>
+        <w:t>Router buffer congestion causes latency spikes (e.g. 25 ms jumping to 250 ms) without disconnecting the physical link.</w:t>
       </w:r>
     </w:p>
     <w:p>
@@ -183,7 +217,7 @@
         <w:rPr>
           <w:rFonts w:ascii="Calibri" w:hAnsi="Calibri"/>
           <w:b/>
-          <w:color w:val="1B365D"/>
+          <w:color w:val="000000"/>
           <w:sz w:val="18"/>
         </w:rPr>
         <w:t xml:space="preserve">Intermittent Packet Loss: </w:t>
@@ -191,10 +225,10 @@
       <w:r>
         <w:rPr>
           <w:rFonts w:ascii="Calibri" w:hAnsi="Calibri"/>
-          <w:color w:val="222222"/>
+          <w:color w:val="000000"/>
           <w:sz w:val="18"/>
         </w:rPr>
-        <w:t>Even 2–5% packet loss triggers severe TCP congestion window reductions, drastically degrading throughput.</w:t>
+        <w:t>Even 2% to 5% packet loss triggers severe TCP congestion window reductions (Multiplicative Decrease), drastically reducing throughput.</w:t>
       </w:r>
     </w:p>
     <w:p>
@@ -206,7 +240,7 @@
         <w:rPr>
           <w:rFonts w:ascii="Calibri" w:hAnsi="Calibri"/>
           <w:b/>
-          <w:color w:val="1B365D"/>
+          <w:color w:val="000000"/>
           <w:sz w:val="18"/>
         </w:rPr>
         <w:t xml:space="preserve">Jitter (Delay Variation): </w:t>
@@ -214,10 +248,10 @@
       <w:r>
         <w:rPr>
           <w:rFonts w:ascii="Calibri" w:hAnsi="Calibri"/>
-          <w:color w:val="222222"/>
+          <w:color w:val="000000"/>
           <w:sz w:val="18"/>
         </w:rPr>
-        <w:t>Irregular packet arrival disrupts real-time multimedia (VoIP, video calls, gaming) by depleting playback buffers.</w:t>
+        <w:t>Irregular packet arrival disrupts real-time multimedia (VoIP, video calls, live streaming) by depleting playback buffers.</w:t>
       </w:r>
     </w:p>
     <w:p>
@@ -229,7 +263,7 @@
         <w:rPr>
           <w:rFonts w:ascii="Calibri" w:hAnsi="Calibri"/>
           <w:b/>
-          <w:color w:val="1B365D"/>
+          <w:color w:val="000000"/>
           <w:sz w:val="18"/>
         </w:rPr>
         <w:t xml:space="preserve">Route Changes &amp; Hop Deviations: </w:t>
@@ -237,7 +271,7 @@
       <w:r>
         <w:rPr>
           <w:rFonts w:ascii="Calibri" w:hAnsi="Calibri"/>
-          <w:color w:val="222222"/>
+          <w:color w:val="000000"/>
           <w:sz w:val="18"/>
         </w:rPr>
         <w:t>Dynamic routing flaps alter transit Autonomous Systems (AS) and hop count silently.</w:t>
@@ -252,7 +286,7 @@
         <w:rPr>
           <w:rFonts w:ascii="Calibri" w:hAnsi="Calibri"/>
           <w:b/>
-          <w:color w:val="2E6B9E"/>
+          <w:color w:val="000000"/>
           <w:sz w:val="21"/>
         </w:rPr>
         <w:t>1.2 Project Objectives</w:t>
@@ -267,7 +301,7 @@
         <w:rPr>
           <w:rFonts w:ascii="Calibri" w:hAnsi="Calibri"/>
           <w:b/>
-          <w:color w:val="1B365D"/>
+          <w:color w:val="000000"/>
           <w:sz w:val="18"/>
         </w:rPr>
         <w:t xml:space="preserve">Multi-Layer Active Probing: </w:t>
@@ -275,7 +309,7 @@
       <w:r>
         <w:rPr>
           <w:rFonts w:ascii="Calibri" w:hAnsi="Calibri"/>
-          <w:color w:val="222222"/>
+          <w:color w:val="000000"/>
           <w:sz w:val="18"/>
         </w:rPr>
         <w:t>Perform continuous, non-privileged probes using ICMP Echo (Layer 3) and TCP/UDP sockets (Layer 4).</w:t>
@@ -290,7 +324,7 @@
         <w:rPr>
           <w:rFonts w:ascii="Calibri" w:hAnsi="Calibri"/>
           <w:b/>
-          <w:color w:val="1B365D"/>
+          <w:color w:val="000000"/>
           <w:sz w:val="18"/>
         </w:rPr>
         <w:t xml:space="preserve">Rolling Window Telemetry: </w:t>
@@ -298,7 +332,7 @@
       <w:r>
         <w:rPr>
           <w:rFonts w:ascii="Calibri" w:hAnsi="Calibri"/>
-          <w:color w:val="222222"/>
+          <w:color w:val="000000"/>
           <w:sz w:val="18"/>
         </w:rPr>
         <w:t>Compute live metrics: RTT, Packet Loss %, Availability %, Jitter, and P95/P99 tail latency.</w:t>
@@ -313,7 +347,7 @@
         <w:rPr>
           <w:rFonts w:ascii="Calibri" w:hAnsi="Calibri"/>
           <w:b/>
-          <w:color w:val="1B365D"/>
+          <w:color w:val="000000"/>
           <w:sz w:val="18"/>
         </w:rPr>
         <w:t xml:space="preserve">Automated Anomaly Detection: </w:t>
@@ -321,7 +355,7 @@
       <w:r>
         <w:rPr>
           <w:rFonts w:ascii="Calibri" w:hAnsi="Calibri"/>
-          <w:color w:val="222222"/>
+          <w:color w:val="000000"/>
           <w:sz w:val="18"/>
         </w:rPr>
         <w:t>Detect link degradation when loss &gt; 5%, P95 latency &gt; 100 ms, or jitter &gt; 20 ms.</w:t>
@@ -336,7 +370,7 @@
         <w:rPr>
           <w:rFonts w:ascii="Calibri" w:hAnsi="Calibri"/>
           <w:b/>
-          <w:color w:val="1B365D"/>
+          <w:color w:val="000000"/>
           <w:sz w:val="18"/>
         </w:rPr>
         <w:t xml:space="preserve">Real-Time Centralized Visibility: </w:t>
@@ -344,7 +378,7 @@
       <w:r>
         <w:rPr>
           <w:rFonts w:ascii="Calibri" w:hAnsi="Calibri"/>
-          <w:color w:val="222222"/>
+          <w:color w:val="000000"/>
           <w:sz w:val="18"/>
         </w:rPr>
         <w:t>Persist timestamped records in SQLite and visualize live network state on a web dashboard.</w:t>
@@ -359,7 +393,7 @@
         <w:rPr>
           <w:rFonts w:ascii="Calibri" w:hAnsi="Calibri"/>
           <w:b/>
-          <w:color w:val="2E6B9E"/>
+          <w:color w:val="000000"/>
           <w:sz w:val="21"/>
         </w:rPr>
         <w:t>1.3 Relevance to Computer Networks Fundamentals</w:t>
@@ -372,7 +406,7 @@
       <w:r>
         <w:rPr>
           <w:rFonts w:ascii="Calibri" w:hAnsi="Calibri"/>
-          <w:color w:val="222222"/>
+          <w:color w:val="000000"/>
           <w:sz w:val="19"/>
         </w:rPr>
         <w:t>NetTelemetry is directly tied to core Computer Networks principles across the TCP/IP stack:</w:t>
@@ -387,7 +421,7 @@
         <w:rPr>
           <w:rFonts w:ascii="Calibri" w:hAnsi="Calibri"/>
           <w:b/>
-          <w:color w:val="1B365D"/>
+          <w:color w:val="000000"/>
           <w:sz w:val="18"/>
         </w:rPr>
         <w:t xml:space="preserve">Layer 3 (Network Layer): </w:t>
@@ -395,7 +429,7 @@
       <w:r>
         <w:rPr>
           <w:rFonts w:ascii="Calibri" w:hAnsi="Calibri"/>
-          <w:color w:val="222222"/>
+          <w:color w:val="000000"/>
           <w:sz w:val="18"/>
         </w:rPr>
         <w:t>Uses ICMP (RFC 792) Echo Request/Reply to measure round-trip delay and inspects IPv4 8-bit TTL headers for hop count.</w:t>
@@ -410,7 +444,7 @@
         <w:rPr>
           <w:rFonts w:ascii="Calibri" w:hAnsi="Calibri"/>
           <w:b/>
-          <w:color w:val="1B365D"/>
+          <w:color w:val="000000"/>
           <w:sz w:val="18"/>
         </w:rPr>
         <w:t xml:space="preserve">Layer 4 (Transport Layer): </w:t>
@@ -418,7 +452,7 @@
       <w:r>
         <w:rPr>
           <w:rFonts w:ascii="Calibri" w:hAnsi="Calibri"/>
-          <w:color w:val="222222"/>
+          <w:color w:val="000000"/>
           <w:sz w:val="18"/>
         </w:rPr>
         <w:t>Executes TCP 3-way handshakes (RFC 793) to measure connection setup delay without application overhead, and tests connectionless UDP datagram delivery (RFC 768).</w:t>
@@ -433,7 +467,7 @@
         <w:rPr>
           <w:rFonts w:ascii="Calibri" w:hAnsi="Calibri"/>
           <w:b/>
-          <w:color w:val="1B365D"/>
+          <w:color w:val="000000"/>
           <w:sz w:val="18"/>
         </w:rPr>
         <w:t xml:space="preserve">Delay Analysis: </w:t>
@@ -441,7 +475,7 @@
       <w:r>
         <w:rPr>
           <w:rFonts w:ascii="Calibri" w:hAnsi="Calibri"/>
-          <w:color w:val="222222"/>
+          <w:color w:val="000000"/>
           <w:sz w:val="18"/>
         </w:rPr>
         <w:t>Directly measures the four delay components: processing delay, queueing delay, transmission delay, and propagation delay.</w:t>
@@ -456,8 +490,8 @@
         <w:rPr>
           <w:rFonts w:ascii="Calibri" w:hAnsi="Calibri"/>
           <w:b/>
-          <w:color w:val="1B365D"/>
-          <w:sz w:val="25"/>
+          <w:color w:val="000000"/>
+          <w:sz w:val="24"/>
         </w:rPr>
         <w:t>2. Network Topology Architecture and Protocols (What Technology, Topology and Protocol Used)</w:t>
       </w:r>
@@ -471,7 +505,7 @@
         <w:rPr>
           <w:rFonts w:ascii="Calibri" w:hAnsi="Calibri"/>
           <w:b/>
-          <w:color w:val="2E6B9E"/>
+          <w:color w:val="000000"/>
           <w:sz w:val="21"/>
         </w:rPr>
         <w:t>2.1 Network Topology: Distributed Star (Hub-and-Spoke)</w:t>
@@ -484,7 +518,7 @@
       <w:r>
         <w:rPr>
           <w:rFonts w:ascii="Calibri" w:hAnsi="Calibri"/>
-          <w:color w:val="222222"/>
+          <w:color w:val="000000"/>
           <w:sz w:val="19"/>
         </w:rPr>
         <w:t>NetTelemetry implements a Distributed Star Active Monitoring Topology where the monitoring agent acts as the central hub probing multiple network spokes simultaneously:</w:t>
@@ -499,7 +533,7 @@
         <w:rPr>
           <w:rFonts w:ascii="Calibri" w:hAnsi="Calibri"/>
           <w:b/>
-          <w:color w:val="1B365D"/>
+          <w:color w:val="000000"/>
           <w:sz w:val="18"/>
         </w:rPr>
         <w:t xml:space="preserve">Local Gateway Spoke (192.168.1.1): </w:t>
@@ -507,7 +541,7 @@
       <w:r>
         <w:rPr>
           <w:rFonts w:ascii="Calibri" w:hAnsi="Calibri"/>
-          <w:color w:val="222222"/>
+          <w:color w:val="000000"/>
           <w:sz w:val="18"/>
         </w:rPr>
         <w:t>Monitors first-hop LAN/Wi-Fi router health and local interface queueing.</w:t>
@@ -522,7 +556,7 @@
         <w:rPr>
           <w:rFonts w:ascii="Calibri" w:hAnsi="Calibri"/>
           <w:b/>
-          <w:color w:val="1B365D"/>
+          <w:color w:val="000000"/>
           <w:sz w:val="18"/>
         </w:rPr>
         <w:t xml:space="preserve">Intranet Service Spoke (127.0.0.1 / Lab Server): </w:t>
@@ -530,7 +564,7 @@
       <w:r>
         <w:rPr>
           <w:rFonts w:ascii="Calibri" w:hAnsi="Calibri"/>
-          <w:color w:val="222222"/>
+          <w:color w:val="000000"/>
           <w:sz w:val="18"/>
         </w:rPr>
         <w:t>Tests local transport-layer TCP ports (80/443/8080) and UDP sockets.</w:t>
@@ -545,7 +579,7 @@
         <w:rPr>
           <w:rFonts w:ascii="Calibri" w:hAnsi="Calibri"/>
           <w:b/>
-          <w:color w:val="1B365D"/>
+          <w:color w:val="000000"/>
           <w:sz w:val="18"/>
         </w:rPr>
         <w:t xml:space="preserve">Public Anycast DNS Spokes (8.8.8.8, 1.1.1.1): </w:t>
@@ -553,7 +587,7 @@
       <w:r>
         <w:rPr>
           <w:rFonts w:ascii="Calibri" w:hAnsi="Calibri"/>
-          <w:color w:val="222222"/>
+          <w:color w:val="000000"/>
           <w:sz w:val="18"/>
         </w:rPr>
         <w:t>Provides a stable Internet transit baseline via Anycast BGP routing.</w:t>
@@ -568,7 +602,7 @@
         <w:rPr>
           <w:rFonts w:ascii="Calibri" w:hAnsi="Calibri"/>
           <w:b/>
-          <w:color w:val="1B365D"/>
+          <w:color w:val="000000"/>
           <w:sz w:val="18"/>
         </w:rPr>
         <w:t xml:space="preserve">Cloud Infrastructure Spokes (GitHub, Microsoft, AWS): </w:t>
@@ -576,7 +610,7 @@
       <w:r>
         <w:rPr>
           <w:rFonts w:ascii="Calibri" w:hAnsi="Calibri"/>
-          <w:color w:val="222222"/>
+          <w:color w:val="000000"/>
           <w:sz w:val="18"/>
         </w:rPr>
         <w:t>Measures WAN latency and multi-hop transit across Autonomous Systems.</w:t>
@@ -632,7 +666,7 @@
           <w:rFonts w:ascii="Calibri" w:hAnsi="Calibri"/>
           <w:b/>
           <w:i/>
-          <w:color w:val="64748B"/>
+          <w:color w:val="3C3C3C"/>
           <w:sz w:val="17"/>
         </w:rPr>
         <w:t>Figure 1: Distributed Star Probing Topology across Gateway, DNS, and Cloud Targets.</w:t>
@@ -647,7 +681,7 @@
         <w:rPr>
           <w:rFonts w:ascii="Calibri" w:hAnsi="Calibri"/>
           <w:b/>
-          <w:color w:val="2E6B9E"/>
+          <w:color w:val="000000"/>
           <w:sz w:val="21"/>
         </w:rPr>
         <w:t>2.2 Protocols Used</w:t>
@@ -659,11 +693,11 @@
         <w:jc w:val="center"/>
         <w:tblLook w:firstColumn="1" w:firstRow="1" w:lastColumn="0" w:lastRow="0" w:noHBand="0" w:noVBand="1" w:val="04A0"/>
         <w:tblBorders>
-          <w:top w:val="single" w:sz="4" w:space="0" w:color="CBD5E1"/>
+          <w:top w:val="single" w:sz="6" w:space="0" w:color="888888"/>
           <w:left w:val="none"/>
-          <w:bottom w:val="single" w:sz="4" w:space="0" w:color="CBD5E1"/>
+          <w:bottom w:val="single" w:sz="6" w:space="0" w:color="888888"/>
           <w:right w:val="none"/>
-          <w:insideH w:val="single" w:sz="4" w:space="0" w:color="CBD5E1"/>
+          <w:insideH w:val="single" w:sz="6" w:space="0" w:color="888888"/>
           <w:insideV w:val="none"/>
         </w:tblBorders>
       </w:tblPr>
@@ -676,7 +710,7 @@
         <w:tc>
           <w:tcPr>
             <w:tcW w:type="dxa" w:w="1728"/>
-            <w:shd w:fill="1B365D"/>
+            <w:shd w:fill="FFFFFF"/>
             <w:tcMar>
               <w:top w:w="120" w:type="dxa"/>
               <w:bottom w:w="120" w:type="dxa"/>
@@ -693,8 +727,8 @@
               <w:rPr>
                 <w:rFonts w:ascii="Calibri" w:hAnsi="Calibri"/>
                 <w:b/>
-                <w:color w:val="FFFFFF"/>
-                <w:sz w:val="18"/>
+                <w:color w:val="000000"/>
+                <w:sz w:val="19"/>
               </w:rPr>
               <w:t>Protocol</w:t>
             </w:r>
@@ -703,7 +737,7 @@
         <w:tc>
           <w:tcPr>
             <w:tcW w:type="dxa" w:w="2016"/>
-            <w:shd w:fill="1B365D"/>
+            <w:shd w:fill="FFFFFF"/>
             <w:tcMar>
               <w:top w:w="120" w:type="dxa"/>
               <w:bottom w:w="120" w:type="dxa"/>
@@ -720,8 +754,8 @@
               <w:rPr>
                 <w:rFonts w:ascii="Calibri" w:hAnsi="Calibri"/>
                 <w:b/>
-                <w:color w:val="FFFFFF"/>
-                <w:sz w:val="18"/>
+                <w:color w:val="000000"/>
+                <w:sz w:val="19"/>
               </w:rPr>
               <w:t>Layer</w:t>
             </w:r>
@@ -730,7 +764,7 @@
         <w:tc>
           <w:tcPr>
             <w:tcW w:type="dxa" w:w="6192"/>
-            <w:shd w:fill="1B365D"/>
+            <w:shd w:fill="FFFFFF"/>
             <w:tcMar>
               <w:top w:w="120" w:type="dxa"/>
               <w:bottom w:w="120" w:type="dxa"/>
@@ -747,8 +781,8 @@
               <w:rPr>
                 <w:rFonts w:ascii="Calibri" w:hAnsi="Calibri"/>
                 <w:b/>
-                <w:color w:val="FFFFFF"/>
-                <w:sz w:val="18"/>
+                <w:color w:val="000000"/>
+                <w:sz w:val="19"/>
               </w:rPr>
               <w:t>Purpose &amp; Mechanism</w:t>
             </w:r>
@@ -776,8 +810,8 @@
               <w:rPr>
                 <w:rFonts w:ascii="Calibri" w:hAnsi="Calibri"/>
                 <w:b/>
-                <w:color w:val="222222"/>
-                <w:sz w:val="17"/>
+                <w:color w:val="000000"/>
+                <w:sz w:val="18"/>
               </w:rPr>
               <w:t>ICMP</w:t>
             </w:r>
@@ -802,8 +836,8 @@
             <w:r>
               <w:rPr>
                 <w:rFonts w:ascii="Calibri" w:hAnsi="Calibri"/>
-                <w:color w:val="222222"/>
-                <w:sz w:val="17"/>
+                <w:color w:val="000000"/>
+                <w:sz w:val="18"/>
               </w:rPr>
               <w:t>Layer 3 (Network)</w:t>
             </w:r>
@@ -828,91 +862,10 @@
             <w:r>
               <w:rPr>
                 <w:rFonts w:ascii="Calibri" w:hAnsi="Calibri"/>
-                <w:color w:val="222222"/>
-                <w:sz w:val="17"/>
+                <w:color w:val="000000"/>
+                <w:sz w:val="18"/>
               </w:rPr>
               <w:t>Type 8 Echo Request &amp; Type 0 Echo Reply. Measures round-trip time and extracts IPv4 TTL.</w:t>
-            </w:r>
-          </w:p>
-        </w:tc>
-      </w:tr>
-      <w:tr>
-        <w:tc>
-          <w:tcPr>
-            <w:tcW w:type="dxa" w:w="1728"/>
-            <w:shd w:fill="F8FAFC"/>
-            <w:tcMar>
-              <w:top w:w="90" w:type="dxa"/>
-              <w:bottom w:w="90" w:type="dxa"/>
-              <w:left w:w="130" w:type="dxa"/>
-              <w:right w:w="130" w:type="dxa"/>
-            </w:tcMar>
-          </w:tcPr>
-          <w:p>
-            <w:pPr>
-              <w:spacing w:before="0" w:after="0" w:line="252" w:lineRule="auto"/>
-              <w:jc w:val="left"/>
-            </w:pPr>
-            <w:r>
-              <w:rPr>
-                <w:rFonts w:ascii="Calibri" w:hAnsi="Calibri"/>
-                <w:b/>
-                <w:color w:val="222222"/>
-                <w:sz w:val="17"/>
-              </w:rPr>
-              <w:t>TCP</w:t>
-            </w:r>
-          </w:p>
-        </w:tc>
-        <w:tc>
-          <w:tcPr>
-            <w:tcW w:type="dxa" w:w="2016"/>
-            <w:shd w:fill="F8FAFC"/>
-            <w:tcMar>
-              <w:top w:w="90" w:type="dxa"/>
-              <w:bottom w:w="90" w:type="dxa"/>
-              <w:left w:w="130" w:type="dxa"/>
-              <w:right w:w="130" w:type="dxa"/>
-            </w:tcMar>
-          </w:tcPr>
-          <w:p>
-            <w:pPr>
-              <w:spacing w:before="0" w:after="0" w:line="252" w:lineRule="auto"/>
-              <w:jc w:val="center"/>
-            </w:pPr>
-            <w:r>
-              <w:rPr>
-                <w:rFonts w:ascii="Calibri" w:hAnsi="Calibri"/>
-                <w:color w:val="222222"/>
-                <w:sz w:val="17"/>
-              </w:rPr>
-              <w:t>Layer 4 (Transport)</w:t>
-            </w:r>
-          </w:p>
-        </w:tc>
-        <w:tc>
-          <w:tcPr>
-            <w:tcW w:type="dxa" w:w="6192"/>
-            <w:shd w:fill="F8FAFC"/>
-            <w:tcMar>
-              <w:top w:w="90" w:type="dxa"/>
-              <w:bottom w:w="90" w:type="dxa"/>
-              <w:left w:w="130" w:type="dxa"/>
-              <w:right w:w="130" w:type="dxa"/>
-            </w:tcMar>
-          </w:tcPr>
-          <w:p>
-            <w:pPr>
-              <w:spacing w:before="0" w:after="0" w:line="252" w:lineRule="auto"/>
-              <w:jc w:val="center"/>
-            </w:pPr>
-            <w:r>
-              <w:rPr>
-                <w:rFonts w:ascii="Calibri" w:hAnsi="Calibri"/>
-                <w:color w:val="222222"/>
-                <w:sz w:val="17"/>
-              </w:rPr>
-              <w:t>Executes 3-way handshake (SYN → SYN-ACK → ACK) to measure transport connect time.</w:t>
             </w:r>
           </w:p>
         </w:tc>
@@ -938,8 +891,89 @@
               <w:rPr>
                 <w:rFonts w:ascii="Calibri" w:hAnsi="Calibri"/>
                 <w:b/>
-                <w:color w:val="222222"/>
-                <w:sz w:val="17"/>
+                <w:color w:val="000000"/>
+                <w:sz w:val="18"/>
+              </w:rPr>
+              <w:t>TCP</w:t>
+            </w:r>
+          </w:p>
+        </w:tc>
+        <w:tc>
+          <w:tcPr>
+            <w:tcW w:type="dxa" w:w="2016"/>
+            <w:shd w:fill="FFFFFF"/>
+            <w:tcMar>
+              <w:top w:w="90" w:type="dxa"/>
+              <w:bottom w:w="90" w:type="dxa"/>
+              <w:left w:w="130" w:type="dxa"/>
+              <w:right w:w="130" w:type="dxa"/>
+            </w:tcMar>
+          </w:tcPr>
+          <w:p>
+            <w:pPr>
+              <w:spacing w:before="0" w:after="0" w:line="252" w:lineRule="auto"/>
+              <w:jc w:val="center"/>
+            </w:pPr>
+            <w:r>
+              <w:rPr>
+                <w:rFonts w:ascii="Calibri" w:hAnsi="Calibri"/>
+                <w:color w:val="000000"/>
+                <w:sz w:val="18"/>
+              </w:rPr>
+              <w:t>Layer 4 (Transport)</w:t>
+            </w:r>
+          </w:p>
+        </w:tc>
+        <w:tc>
+          <w:tcPr>
+            <w:tcW w:type="dxa" w:w="6192"/>
+            <w:shd w:fill="FFFFFF"/>
+            <w:tcMar>
+              <w:top w:w="90" w:type="dxa"/>
+              <w:bottom w:w="90" w:type="dxa"/>
+              <w:left w:w="130" w:type="dxa"/>
+              <w:right w:w="130" w:type="dxa"/>
+            </w:tcMar>
+          </w:tcPr>
+          <w:p>
+            <w:pPr>
+              <w:spacing w:before="0" w:after="0" w:line="252" w:lineRule="auto"/>
+              <w:jc w:val="center"/>
+            </w:pPr>
+            <w:r>
+              <w:rPr>
+                <w:rFonts w:ascii="Calibri" w:hAnsi="Calibri"/>
+                <w:color w:val="000000"/>
+                <w:sz w:val="18"/>
+              </w:rPr>
+              <w:t>Executes 3-way handshake (SYN -&gt; SYN-ACK -&gt; ACK) to measure transport connect time.</w:t>
+            </w:r>
+          </w:p>
+        </w:tc>
+      </w:tr>
+      <w:tr>
+        <w:tc>
+          <w:tcPr>
+            <w:tcW w:type="dxa" w:w="1728"/>
+            <w:shd w:fill="FFFFFF"/>
+            <w:tcMar>
+              <w:top w:w="90" w:type="dxa"/>
+              <w:bottom w:w="90" w:type="dxa"/>
+              <w:left w:w="130" w:type="dxa"/>
+              <w:right w:w="130" w:type="dxa"/>
+            </w:tcMar>
+          </w:tcPr>
+          <w:p>
+            <w:pPr>
+              <w:spacing w:before="0" w:after="0" w:line="252" w:lineRule="auto"/>
+              <w:jc w:val="left"/>
+            </w:pPr>
+            <w:r>
+              <w:rPr>
+                <w:rFonts w:ascii="Calibri" w:hAnsi="Calibri"/>
+                <w:b/>
+                <w:color w:val="000000"/>
+                <w:sz w:val="18"/>
               </w:rPr>
               <w:t>UDP</w:t>
             </w:r>
@@ -964,8 +998,8 @@
             <w:r>
               <w:rPr>
                 <w:rFonts w:ascii="Calibri" w:hAnsi="Calibri"/>
-                <w:color w:val="222222"/>
-                <w:sz w:val="17"/>
+                <w:color w:val="000000"/>
+                <w:sz w:val="18"/>
               </w:rPr>
               <w:t>Layer 4 (Transport)</w:t>
             </w:r>
@@ -990,8 +1024,8 @@
             <w:r>
               <w:rPr>
                 <w:rFonts w:ascii="Calibri" w:hAnsi="Calibri"/>
-                <w:color w:val="222222"/>
-                <w:sz w:val="17"/>
+                <w:color w:val="000000"/>
+                <w:sz w:val="18"/>
               </w:rPr>
               <w:t>Sends lightweight datagrams to observe unacknowledged best-effort delivery and drops.</w:t>
             </w:r>
@@ -1002,7 +1036,7 @@
         <w:tc>
           <w:tcPr>
             <w:tcW w:type="dxa" w:w="1728"/>
-            <w:shd w:fill="F8FAFC"/>
+            <w:shd w:fill="FFFFFF"/>
             <w:tcMar>
               <w:top w:w="90" w:type="dxa"/>
               <w:bottom w:w="90" w:type="dxa"/>
@@ -1019,8 +1053,8 @@
               <w:rPr>
                 <w:rFonts w:ascii="Calibri" w:hAnsi="Calibri"/>
                 <w:b/>
-                <w:color w:val="222222"/>
-                <w:sz w:val="17"/>
+                <w:color w:val="000000"/>
+                <w:sz w:val="18"/>
               </w:rPr>
               <w:t>IPv4 / DNS</w:t>
             </w:r>
@@ -1029,7 +1063,7 @@
         <w:tc>
           <w:tcPr>
             <w:tcW w:type="dxa" w:w="2016"/>
-            <w:shd w:fill="F8FAFC"/>
+            <w:shd w:fill="FFFFFF"/>
             <w:tcMar>
               <w:top w:w="90" w:type="dxa"/>
               <w:bottom w:w="90" w:type="dxa"/>
@@ -1045,8 +1079,8 @@
             <w:r>
               <w:rPr>
                 <w:rFonts w:ascii="Calibri" w:hAnsi="Calibri"/>
-                <w:color w:val="222222"/>
-                <w:sz w:val="17"/>
+                <w:color w:val="000000"/>
+                <w:sz w:val="18"/>
               </w:rPr>
               <w:t>Layer 3 / Layer 7</w:t>
             </w:r>
@@ -1055,7 +1089,7 @@
         <w:tc>
           <w:tcPr>
             <w:tcW w:type="dxa" w:w="6192"/>
-            <w:shd w:fill="F8FAFC"/>
+            <w:shd w:fill="FFFFFF"/>
             <w:tcMar>
               <w:top w:w="90" w:type="dxa"/>
               <w:bottom w:w="90" w:type="dxa"/>
@@ -1071,8 +1105,8 @@
             <w:r>
               <w:rPr>
                 <w:rFonts w:ascii="Calibri" w:hAnsi="Calibri"/>
-                <w:color w:val="222222"/>
-                <w:sz w:val="17"/>
+                <w:color w:val="000000"/>
+                <w:sz w:val="18"/>
               </w:rPr>
               <w:t>Resolves hostnames to 32-bit IPv4 addresses and delivers packets across routed hops.</w:t>
             </w:r>
@@ -1135,7 +1169,7 @@
           <w:rFonts w:ascii="Calibri" w:hAnsi="Calibri"/>
           <w:b/>
           <w:i/>
-          <w:color w:val="64748B"/>
+          <w:color w:val="3C3C3C"/>
           <w:sz w:val="17"/>
         </w:rPr>
         <w:t>Figure 2: Protocol Timing Comparison: ICMP Echo (Layer 3) vs. TCP 3-Way Handshake (Layer 4).</w:t>
@@ -1150,7 +1184,7 @@
         <w:rPr>
           <w:rFonts w:ascii="Calibri" w:hAnsi="Calibri"/>
           <w:b/>
-          <w:color w:val="2E6B9E"/>
+          <w:color w:val="000000"/>
           <w:sz w:val="21"/>
         </w:rPr>
         <w:t>2.3 Technology Stack</w:t>
@@ -1163,7 +1197,7 @@
       <w:r>
         <w:rPr>
           <w:rFonts w:ascii="Calibri" w:hAnsi="Calibri"/>
-          <w:color w:val="222222"/>
+          <w:color w:val="000000"/>
           <w:sz w:val="19"/>
         </w:rPr>
         <w:t>• Python 3 Standard Library (Sockets, ThreadPoolExecutor, Datetime, Math)</w:t>
@@ -1184,8 +1218,8 @@
         <w:rPr>
           <w:rFonts w:ascii="Calibri" w:hAnsi="Calibri"/>
           <w:b/>
-          <w:color w:val="1B365D"/>
-          <w:sz w:val="25"/>
+          <w:color w:val="000000"/>
+          <w:sz w:val="24"/>
         </w:rPr>
         <w:t>3. Implementation and Functionalities (Working Model, Configuration, Coding (Network Part) and Execution Results)</w:t>
       </w:r>
@@ -1199,7 +1233,7 @@
         <w:rPr>
           <w:rFonts w:ascii="Calibri" w:hAnsi="Calibri"/>
           <w:b/>
-          <w:color w:val="2E6B9E"/>
+          <w:color w:val="000000"/>
           <w:sz w:val="21"/>
         </w:rPr>
         <w:t>3.1 Working Model &amp; Workflow</w:t>
@@ -1212,10 +1246,66 @@
       <w:r>
         <w:rPr>
           <w:rFonts w:ascii="Calibri" w:hAnsi="Calibri"/>
-          <w:color w:val="222222"/>
+          <w:color w:val="000000"/>
           <w:sz w:val="19"/>
         </w:rPr>
-        <w:t>The system operates in a continuous automated loop: (1) Ingests target list from `config.json`, (2) Resolves hostnames to IP addresses, (3) Dispatches concurrent ICMP/TCP/UDP probes across worker threads, (4) Computes sliding-window metrics, (5) Checks for anomalies against thresholds, and (6) Persists telemetry in SQLite and renders on the Streamlit dashboard.</w:t>
+        <w:t>The system operates in a continuous automated loop: (1) Ingests target list from `config.json`, (2) Resolves hostnames to IP addresses via DNS, (3) Dispatches concurrent ICMP/TCP/UDP probes across worker threads, (4) Computes sliding-window metrics, (5) Checks for anomalies against thresholds, and (6) Persists telemetry in SQLite and renders on the Streamlit dashboard.</w:t>
+      </w:r>
+    </w:p>
+    <w:p>
+      <w:pPr>
+        <w:spacing w:before="120" w:after="40"/>
+        <w:jc w:val="center"/>
+      </w:pPr>
+      <w:r>
+        <w:drawing>
+          <wp:inline xmlns:a="http://schemas.openxmlformats.org/drawingml/2006/main" xmlns:pic="http://schemas.openxmlformats.org/drawingml/2006/picture">
+            <wp:extent cx="4937760" cy="2896186"/>
+            <wp:docPr id="3" name="Picture 3"/>
+            <wp:cNvGraphicFramePr>
+              <a:graphicFrameLocks noChangeAspect="1"/>
+            </wp:cNvGraphicFramePr>
+            <a:graphic>
+              <a:graphicData uri="http://schemas.openxmlformats.org/drawingml/2006/picture">
+                <pic:pic>
+                  <pic:nvPicPr>
+                    <pic:cNvPr id="0" name="diagram4_telemetry_pipeline.png"/>
+                    <pic:cNvPicPr/>
+                  </pic:nvPicPr>
+                  <pic:blipFill>
+                    <a:blip r:embed="rId13"/>
+                    <a:stretch>
+                      <a:fillRect/>
+                    </a:stretch>
+                  </pic:blipFill>
+                  <pic:spPr>
+                    <a:xfrm>
+                      <a:off x="0" y="0"/>
+                      <a:ext cx="4937760" cy="2896186"/>
+                    </a:xfrm>
+                    <a:prstGeom prst="rect"/>
+                  </pic:spPr>
+                </pic:pic>
+              </a:graphicData>
+            </a:graphic>
+          </wp:inline>
+        </w:drawing>
+      </w:r>
+    </w:p>
+    <w:p>
+      <w:pPr>
+        <w:spacing w:before="0" w:after="120"/>
+        <w:jc w:val="center"/>
+      </w:pPr>
+      <w:r>
+        <w:rPr>
+          <w:rFonts w:ascii="Calibri" w:hAnsi="Calibri"/>
+          <w:b/>
+          <w:i/>
+          <w:color w:val="3C3C3C"/>
+          <w:sz w:val="17"/>
+        </w:rPr>
+        <w:t>Figure 3: Continuous Telemetry Lifecycle, Sliding-Window Metric Computation, and Anomaly Engine.</w:t>
       </w:r>
     </w:p>
     <w:p>
@@ -1227,7 +1317,7 @@
         <w:rPr>
           <w:rFonts w:ascii="Calibri" w:hAnsi="Calibri"/>
           <w:b/>
-          <w:color w:val="2E6B9E"/>
+          <w:color w:val="000000"/>
           <w:sz w:val="21"/>
         </w:rPr>
         <w:t>3.2 Target Configuration (`config.json`)</w:t>
@@ -1241,7 +1331,7 @@
         <w:rPr>
           <w:rFonts w:ascii="Calibri" w:hAnsi="Calibri"/>
           <w:b/>
-          <w:color w:val="1B365D"/>
+          <w:color w:val="000000"/>
           <w:sz w:val="19"/>
         </w:rPr>
         <w:t xml:space="preserve">Configuration Schema: </w:t>
@@ -1249,24 +1339,88 @@
       <w:r>
         <w:rPr>
           <w:rFonts w:ascii="Calibri" w:hAnsi="Calibri"/>
-          <w:color w:val="222222"/>
+          <w:color w:val="000000"/>
           <w:sz w:val="19"/>
         </w:rPr>
-        <w:t>Endpoints are configured cleanly via JSON without modifying source code:</w:t>
+        <w:t>Endpoints are configured cleanly via JSON without modifying application source code:</w:t>
       </w:r>
     </w:p>
     <w:p>
       <w:pPr>
-        <w:spacing w:before="0" w:after="120" w:line="269" w:lineRule="auto"/>
+        <w:keepNext/>
+        <w:spacing w:before="100" w:after="40"/>
       </w:pPr>
       <w:r>
         <w:rPr>
           <w:rFonts w:ascii="Calibri" w:hAnsi="Calibri"/>
-          <w:color w:val="222222"/>
-          <w:sz w:val="19"/>
+          <w:b/>
+          <w:color w:val="000000"/>
+          <w:sz w:val="18"/>
         </w:rPr>
-        <w:t>{"targets": [{"target_id": "google", "host": "8.8.8.8", "interval": 5, "timeout": 2}, {"target_id": "cloudflare", "host": "1.1.1.1", "interval": 5, "timeout": 2}]}</w:t>
+        <w:t>Code Listing: Target Configuration in config.json</w:t>
       </w:r>
+    </w:p>
+    <w:tbl>
+      <w:tblPr>
+        <w:tblW w:type="auto" w:w="0"/>
+        <w:jc w:val="center"/>
+        <w:tblLook w:firstColumn="1" w:firstRow="1" w:lastColumn="0" w:lastRow="0" w:noHBand="0" w:noVBand="1" w:val="04A0"/>
+      </w:tblPr>
+      <w:tblGrid>
+        <w:gridCol w:w="9936"/>
+      </w:tblGrid>
+      <w:tr>
+        <w:tc>
+          <w:tcPr>
+            <w:tcW w:type="dxa" w:w="9936"/>
+            <w:shd w:fill="FFFFFF"/>
+            <w:tcMar>
+              <w:top w:w="80" w:type="dxa"/>
+              <w:bottom w:w="80" w:type="dxa"/>
+              <w:left w:w="120" w:type="dxa"/>
+              <w:right w:w="120" w:type="dxa"/>
+            </w:tcMar>
+            <w:tcBorders>
+              <w:top w:val="single" w:sz="4" w:space="0" w:color="999999"/>
+              <w:left w:val="single" w:sz="12" w:space="0" w:color="000000"/>
+              <w:bottom w:val="single" w:sz="4" w:space="0" w:color="999999"/>
+              <w:right w:val="single" w:sz="4" w:space="0" w:color="999999"/>
+            </w:tcBorders>
+          </w:tcPr>
+          <w:p>
+            <w:pPr>
+              <w:spacing w:before="0" w:after="0" w:line="252" w:lineRule="auto"/>
+            </w:pPr>
+            <w:r>
+              <w:rPr>
+                <w:rFonts w:ascii="Consolas" w:hAnsi="Consolas"/>
+                <w:color w:val="000000"/>
+                <w:sz w:val="16"/>
+              </w:rPr>
+              <w:t>{</w:t>
+              <w:br/>
+              <w:t xml:space="preserve">  "targets": [</w:t>
+              <w:br/>
+              <w:t xml:space="preserve">    { "target_id": "google",     "name": "Google DNS",  "host": "8.8.8.8",      "enabled": true, "interval": 5, "timeout": 2 },</w:t>
+              <w:br/>
+              <w:t xml:space="preserve">    { "target_id": "cloudflare", "name": "Cloudflare",  "host": "1.1.1.1",      "enabled": true, "interval": 5, "timeout": 2 },</w:t>
+              <w:br/>
+              <w:t xml:space="preserve">    { "target_id": "github",     "name": "GitHub",      "host": "140.82.121.3", "enabled": true, "interval": 5, "timeout": 2 },</w:t>
+              <w:br/>
+              <w:t xml:space="preserve">    { "target_id": "microsoft",  "name": "Microsoft",   "host": "20.190.164.4", "enabled": true, "interval": 5, "timeout": 2 }</w:t>
+              <w:br/>
+              <w:t xml:space="preserve">  ]</w:t>
+              <w:br/>
+              <w:t>}</w:t>
+            </w:r>
+          </w:p>
+        </w:tc>
+      </w:tr>
+    </w:tbl>
+    <w:p>
+      <w:pPr>
+        <w:spacing w:after="80"/>
+      </w:pPr>
     </w:p>
     <w:p>
       <w:pPr>
@@ -1277,10 +1431,10 @@
         <w:rPr>
           <w:rFonts w:ascii="Calibri" w:hAnsi="Calibri"/>
           <w:b/>
-          <w:color w:val="2E6B9E"/>
+          <w:color w:val="000000"/>
           <w:sz w:val="21"/>
         </w:rPr>
-        <w:t>3.3 Core Network Coding Implementation</w:t>
+        <w:t>3.3 Coding (Network Part Walkthrough)</w:t>
       </w:r>
     </w:p>
     <w:p>
@@ -1290,64 +1444,483 @@
       <w:r>
         <w:rPr>
           <w:rFonts w:ascii="Calibri" w:hAnsi="Calibri"/>
-          <w:b/>
-          <w:color w:val="1B365D"/>
+          <w:color w:val="000000"/>
           <w:sz w:val="19"/>
         </w:rPr>
-        <w:t xml:space="preserve">1. ICMP Engine: </w:t>
-      </w:r>
-      <w:r>
-        <w:rPr>
-          <w:rFonts w:ascii="Calibri" w:hAnsi="Calibri"/>
-          <w:color w:val="222222"/>
-          <w:sz w:val="19"/>
-        </w:rPr>
-        <w:t>• Native Win32 ICMP: Calls Windows `iphlpapi.IcmpSendEcho` via `ctypes` without requiring administrator root privileges, extracting `RoundTripTime` and `Options.Ttl` directly from the kernel response buffer.</w:t>
+        <w:t>Below are the actual Python implementations that perform low-level networking operations across the project:</w:t>
       </w:r>
     </w:p>
     <w:p>
       <w:pPr>
-        <w:spacing w:before="0" w:after="80" w:line="269" w:lineRule="auto"/>
+        <w:keepNext/>
+        <w:spacing w:before="100" w:after="40"/>
       </w:pPr>
       <w:r>
         <w:rPr>
           <w:rFonts w:ascii="Calibri" w:hAnsi="Calibri"/>
           <w:b/>
-          <w:color w:val="1B365D"/>
-          <w:sz w:val="19"/>
+          <w:color w:val="000000"/>
+          <w:sz w:val="18"/>
         </w:rPr>
-        <w:t xml:space="preserve">2. TCP Engine: </w:t>
+        <w:t>Code Listing: Native ICMP Echo Probing (network/icmp_monitor.py)</w:t>
       </w:r>
-      <w:r>
-        <w:rPr>
-          <w:rFonts w:ascii="Calibri" w:hAnsi="Calibri"/>
-          <w:color w:val="222222"/>
-          <w:sz w:val="19"/>
-        </w:rPr>
-        <w:t>• TCP Connect Timer: Opens a non-blocking `socket.socket(AF_INET, SOCK_STREAM)` to measure the exact millisecond duration of the TCP 3-way handshake to any designated service port.</w:t>
-      </w:r>
+    </w:p>
+    <w:tbl>
+      <w:tblPr>
+        <w:tblW w:type="auto" w:w="0"/>
+        <w:jc w:val="center"/>
+        <w:tblLook w:firstColumn="1" w:firstRow="1" w:lastColumn="0" w:lastRow="0" w:noHBand="0" w:noVBand="1" w:val="04A0"/>
+      </w:tblPr>
+      <w:tblGrid>
+        <w:gridCol w:w="9936"/>
+      </w:tblGrid>
+      <w:tr>
+        <w:tc>
+          <w:tcPr>
+            <w:tcW w:type="dxa" w:w="9936"/>
+            <w:shd w:fill="FFFFFF"/>
+            <w:tcMar>
+              <w:top w:w="80" w:type="dxa"/>
+              <w:bottom w:w="80" w:type="dxa"/>
+              <w:left w:w="120" w:type="dxa"/>
+              <w:right w:w="120" w:type="dxa"/>
+            </w:tcMar>
+            <w:tcBorders>
+              <w:top w:val="single" w:sz="4" w:space="0" w:color="999999"/>
+              <w:left w:val="single" w:sz="12" w:space="0" w:color="000000"/>
+              <w:bottom w:val="single" w:sz="4" w:space="0" w:color="999999"/>
+              <w:right w:val="single" w:sz="4" w:space="0" w:color="999999"/>
+            </w:tcBorders>
+          </w:tcPr>
+          <w:p>
+            <w:pPr>
+              <w:spacing w:before="0" w:after="0" w:line="252" w:lineRule="auto"/>
+            </w:pPr>
+            <w:r>
+              <w:rPr>
+                <w:rFonts w:ascii="Consolas" w:hAnsi="Consolas"/>
+                <w:color w:val="000000"/>
+                <w:sz w:val="16"/>
+              </w:rPr>
+              <w:t># network/icmp_monitor.py - Native Windows ICMP Echo via ctypes (no root needed)</w:t>
+              <w:br/>
+              <w:t>import ctypes</w:t>
+              <w:br/>
+              <w:t>from ctypes import wintypes</w:t>
+              <w:br/>
+              <w:t>import socket, time</w:t>
+              <w:br/>
+              <w:br/>
+              <w:t>class IP_OPTION_INFORMATION(ctypes.Structure):</w:t>
+              <w:br/>
+              <w:t xml:space="preserve">    _fields_ = [("Ttl", ctypes.c_ubyte), ("Tos", ctypes.c_ubyte), ("Flags", ctypes.c_ubyte)]</w:t>
+              <w:br/>
+              <w:br/>
+              <w:t>class ICMP_ECHO_REPLY(ctypes.Structure):</w:t>
+              <w:br/>
+              <w:t xml:space="preserve">    _fields_ = [("Address", ctypes.c_ulong), ("Status", ctypes.c_ulong),</w:t>
+              <w:br/>
+              <w:t xml:space="preserve">                ("RoundTripTime", ctypes.c_ulong), ("DataSize", ctypes.c_ushort),</w:t>
+              <w:br/>
+              <w:t xml:space="preserve">                ("Reserved", ctypes.c_ushort), ("Data", ctypes.c_void_p),</w:t>
+              <w:br/>
+              <w:t xml:space="preserve">                ("Options", IP_OPTION_INFORMATION)]</w:t>
+              <w:br/>
+              <w:br/>
+              <w:t>def ping(ip_address: str, timeout_ms: int = 1000):</w:t>
+              <w:br/>
+              <w:t xml:space="preserve">    iphlpapi = ctypes.windll.iphlpapi</w:t>
+              <w:br/>
+              <w:t xml:space="preserve">    handle = iphlpapi.IcmpCreateFile()</w:t>
+              <w:br/>
+              <w:t xml:space="preserve">    dest_addr = ctypes.c_ulong.from_buffer_copy(socket.inet_aton(ip_address)).value</w:t>
+              <w:br/>
+              <w:t xml:space="preserve">    payload = b"NetTelemetry"</w:t>
+              <w:br/>
+              <w:t xml:space="preserve">    reply_buffer = ctypes.create_string_buffer(ctypes.sizeof(ICMP_ECHO_REPLY) + len(payload) + 8)</w:t>
+              <w:br/>
+              <w:br/>
+              <w:t xml:space="preserve">    replies = iphlpapi.IcmpSendEcho(handle, dest_addr, payload, len(payload),</w:t>
+              <w:br/>
+              <w:t xml:space="preserve">                                    None, reply_buffer, len(reply_buffer), timeout_ms)</w:t>
+              <w:br/>
+              <w:t xml:space="preserve">    if replies &gt; 0:</w:t>
+              <w:br/>
+              <w:t xml:space="preserve">        reply = ICMP_ECHO_REPLY.from_buffer(reply_buffer)</w:t>
+              <w:br/>
+              <w:t xml:space="preserve">        if reply.Status == 0:  # IP_SUCCESS</w:t>
+              <w:br/>
+              <w:t xml:space="preserve">            return {"success": True, "rtt_ms": float(reply.RoundTripTime), "ttl": int(reply.Options.Ttl)}</w:t>
+              <w:br/>
+              <w:t xml:space="preserve">    return {"success": False, "rtt_ms": None, "ttl": None, "error": "timeout"}</w:t>
+            </w:r>
+          </w:p>
+        </w:tc>
+      </w:tr>
+    </w:tbl>
+    <w:p>
+      <w:pPr>
+        <w:spacing w:after="80"/>
+      </w:pPr>
     </w:p>
     <w:p>
       <w:pPr>
-        <w:spacing w:before="0" w:after="80" w:line="269" w:lineRule="auto"/>
+        <w:keepNext/>
+        <w:spacing w:before="100" w:after="40"/>
       </w:pPr>
       <w:r>
         <w:rPr>
           <w:rFonts w:ascii="Calibri" w:hAnsi="Calibri"/>
           <w:b/>
-          <w:color w:val="1B365D"/>
-          <w:sz w:val="19"/>
+          <w:color w:val="000000"/>
+          <w:sz w:val="18"/>
         </w:rPr>
-        <w:t xml:space="preserve">3. Metrics Engine: </w:t>
+        <w:t>Code Listing: TCP Socket Handshake Measurement (network/tcp_monitor.py)</w:t>
       </w:r>
+    </w:p>
+    <w:tbl>
+      <w:tblPr>
+        <w:tblW w:type="auto" w:w="0"/>
+        <w:jc w:val="center"/>
+        <w:tblLook w:firstColumn="1" w:firstRow="1" w:lastColumn="0" w:lastRow="0" w:noHBand="0" w:noVBand="1" w:val="04A0"/>
+      </w:tblPr>
+      <w:tblGrid>
+        <w:gridCol w:w="9936"/>
+      </w:tblGrid>
+      <w:tr>
+        <w:tc>
+          <w:tcPr>
+            <w:tcW w:type="dxa" w:w="9936"/>
+            <w:shd w:fill="FFFFFF"/>
+            <w:tcMar>
+              <w:top w:w="80" w:type="dxa"/>
+              <w:bottom w:w="80" w:type="dxa"/>
+              <w:left w:w="120" w:type="dxa"/>
+              <w:right w:w="120" w:type="dxa"/>
+            </w:tcMar>
+            <w:tcBorders>
+              <w:top w:val="single" w:sz="4" w:space="0" w:color="999999"/>
+              <w:left w:val="single" w:sz="12" w:space="0" w:color="000000"/>
+              <w:bottom w:val="single" w:sz="4" w:space="0" w:color="999999"/>
+              <w:right w:val="single" w:sz="4" w:space="0" w:color="999999"/>
+            </w:tcBorders>
+          </w:tcPr>
+          <w:p>
+            <w:pPr>
+              <w:spacing w:before="0" w:after="0" w:line="252" w:lineRule="auto"/>
+            </w:pPr>
+            <w:r>
+              <w:rPr>
+                <w:rFonts w:ascii="Consolas" w:hAnsi="Consolas"/>
+                <w:color w:val="000000"/>
+                <w:sz w:val="16"/>
+              </w:rPr>
+              <w:t># network/tcp_monitor.py - Transport Layer 3-Way Handshake Latency</w:t>
+              <w:br/>
+              <w:t>import socket, time</w:t>
+              <w:br/>
+              <w:br/>
+              <w:t>def measure_tcp_connect(host: str, port: int, timeout: int = 5):</w:t>
+              <w:br/>
+              <w:t xml:space="preserve">    start_time = time.time()</w:t>
+              <w:br/>
+              <w:t xml:space="preserve">    try:</w:t>
+              <w:br/>
+              <w:t xml:space="preserve">        with socket.socket(socket.AF_INET, socket.SOCK_STREAM) as sock:</w:t>
+              <w:br/>
+              <w:t xml:space="preserve">            sock.settimeout(timeout)</w:t>
+              <w:br/>
+              <w:t xml:space="preserve">            sock.connect((host, port)) # Completes TCP SYN -&gt; SYN-ACK -&gt; ACK</w:t>
+              <w:br/>
+              <w:t xml:space="preserve">        rtt_ms = (time.time() - start_time) * 1000.0</w:t>
+              <w:br/>
+              <w:t xml:space="preserve">        return {"success": True, "rtt_ms": round(rtt_ms, 2), "error": None}</w:t>
+              <w:br/>
+              <w:t xml:space="preserve">    except socket.timeout:</w:t>
+              <w:br/>
+              <w:t xml:space="preserve">        return {"success": False, "rtt_ms": None, "error": "timeout"}</w:t>
+              <w:br/>
+              <w:t xml:space="preserve">    except Exception as e:</w:t>
+              <w:br/>
+              <w:t xml:space="preserve">        return {"success": False, "rtt_ms": None, "error": str(e)}</w:t>
+            </w:r>
+          </w:p>
+        </w:tc>
+      </w:tr>
+    </w:tbl>
+    <w:p>
+      <w:pPr>
+        <w:spacing w:after="80"/>
+      </w:pPr>
+    </w:p>
+    <w:p>
+      <w:pPr>
+        <w:keepNext/>
+        <w:spacing w:before="100" w:after="40"/>
+      </w:pPr>
       <w:r>
         <w:rPr>
           <w:rFonts w:ascii="Calibri" w:hAnsi="Calibri"/>
-          <w:color w:val="222222"/>
-          <w:sz w:val="19"/>
+          <w:b/>
+          <w:color w:val="000000"/>
+          <w:sz w:val="18"/>
         </w:rPr>
-        <w:t>• Mathematical Formulas: RTT = t_reply - t_send (ms); Loss % = (Failed / Total) * 100; Availability % = (Success / Total) * 100; Jitter = (1/(N-1)) * Sum(|RTT_i - RTT_{i-1}|); P95 = 95th percentile latency.</w:t>
+        <w:t>Code Listing: UDP Datagram Timing (network/udp_monitor.py)</w:t>
       </w:r>
+    </w:p>
+    <w:tbl>
+      <w:tblPr>
+        <w:tblW w:type="auto" w:w="0"/>
+        <w:jc w:val="center"/>
+        <w:tblLook w:firstColumn="1" w:firstRow="1" w:lastColumn="0" w:lastRow="0" w:noHBand="0" w:noVBand="1" w:val="04A0"/>
+      </w:tblPr>
+      <w:tblGrid>
+        <w:gridCol w:w="9936"/>
+      </w:tblGrid>
+      <w:tr>
+        <w:tc>
+          <w:tcPr>
+            <w:tcW w:type="dxa" w:w="9936"/>
+            <w:shd w:fill="FFFFFF"/>
+            <w:tcMar>
+              <w:top w:w="80" w:type="dxa"/>
+              <w:bottom w:w="80" w:type="dxa"/>
+              <w:left w:w="120" w:type="dxa"/>
+              <w:right w:w="120" w:type="dxa"/>
+            </w:tcMar>
+            <w:tcBorders>
+              <w:top w:val="single" w:sz="4" w:space="0" w:color="999999"/>
+              <w:left w:val="single" w:sz="12" w:space="0" w:color="000000"/>
+              <w:bottom w:val="single" w:sz="4" w:space="0" w:color="999999"/>
+              <w:right w:val="single" w:sz="4" w:space="0" w:color="999999"/>
+            </w:tcBorders>
+          </w:tcPr>
+          <w:p>
+            <w:pPr>
+              <w:spacing w:before="0" w:after="0" w:line="252" w:lineRule="auto"/>
+            </w:pPr>
+            <w:r>
+              <w:rPr>
+                <w:rFonts w:ascii="Consolas" w:hAnsi="Consolas"/>
+                <w:color w:val="000000"/>
+                <w:sz w:val="16"/>
+              </w:rPr>
+              <w:t># network/udp_monitor.py - Connectionless UDP Datagram Timing</w:t>
+              <w:br/>
+              <w:t>import socket, time</w:t>
+              <w:br/>
+              <w:br/>
+              <w:t>def measure_udp_ping(host: str, port: int, timeout: int = 5):</w:t>
+              <w:br/>
+              <w:t xml:space="preserve">    start_time = time.time()</w:t>
+              <w:br/>
+              <w:t xml:space="preserve">    try:</w:t>
+              <w:br/>
+              <w:t xml:space="preserve">        with socket.socket(socket.AF_INET, socket.SOCK_DGRAM) as sock:</w:t>
+              <w:br/>
+              <w:t xml:space="preserve">            sock.settimeout(timeout)</w:t>
+              <w:br/>
+              <w:t xml:space="preserve">            sock.sendto(b"ping", (host, port))</w:t>
+              <w:br/>
+              <w:t xml:space="preserve">            data, _ = sock.recvfrom(1024)</w:t>
+              <w:br/>
+              <w:t xml:space="preserve">        rtt_ms = (time.time() - start_time) * 1000.0</w:t>
+              <w:br/>
+              <w:t xml:space="preserve">        return {"success": True, "rtt_ms": round(rtt_ms, 2), "error": None}</w:t>
+              <w:br/>
+              <w:t xml:space="preserve">    except socket.timeout:</w:t>
+              <w:br/>
+              <w:t xml:space="preserve">        return {"success": False, "rtt_ms": None, "error": "timeout"}</w:t>
+            </w:r>
+          </w:p>
+        </w:tc>
+      </w:tr>
+    </w:tbl>
+    <w:p>
+      <w:pPr>
+        <w:spacing w:after="80"/>
+      </w:pPr>
+    </w:p>
+    <w:p>
+      <w:pPr>
+        <w:keepNext/>
+        <w:spacing w:before="100" w:after="40"/>
+      </w:pPr>
+      <w:r>
+        <w:rPr>
+          <w:rFonts w:ascii="Calibri" w:hAnsi="Calibri"/>
+          <w:b/>
+          <w:color w:val="000000"/>
+          <w:sz w:val="18"/>
+        </w:rPr>
+        <w:t>Code Listing: Network Quality Metrics (telemetry/metrics.py)</w:t>
+      </w:r>
+    </w:p>
+    <w:tbl>
+      <w:tblPr>
+        <w:tblW w:type="auto" w:w="0"/>
+        <w:jc w:val="center"/>
+        <w:tblLook w:firstColumn="1" w:firstRow="1" w:lastColumn="0" w:lastRow="0" w:noHBand="0" w:noVBand="1" w:val="04A0"/>
+      </w:tblPr>
+      <w:tblGrid>
+        <w:gridCol w:w="9936"/>
+      </w:tblGrid>
+      <w:tr>
+        <w:tc>
+          <w:tcPr>
+            <w:tcW w:type="dxa" w:w="9936"/>
+            <w:shd w:fill="FFFFFF"/>
+            <w:tcMar>
+              <w:top w:w="80" w:type="dxa"/>
+              <w:bottom w:w="80" w:type="dxa"/>
+              <w:left w:w="120" w:type="dxa"/>
+              <w:right w:w="120" w:type="dxa"/>
+            </w:tcMar>
+            <w:tcBorders>
+              <w:top w:val="single" w:sz="4" w:space="0" w:color="999999"/>
+              <w:left w:val="single" w:sz="12" w:space="0" w:color="000000"/>
+              <w:bottom w:val="single" w:sz="4" w:space="0" w:color="999999"/>
+              <w:right w:val="single" w:sz="4" w:space="0" w:color="999999"/>
+            </w:tcBorders>
+          </w:tcPr>
+          <w:p>
+            <w:pPr>
+              <w:spacing w:before="0" w:after="0" w:line="252" w:lineRule="auto"/>
+            </w:pPr>
+            <w:r>
+              <w:rPr>
+                <w:rFonts w:ascii="Consolas" w:hAnsi="Consolas"/>
+                <w:color w:val="000000"/>
+                <w:sz w:val="16"/>
+              </w:rPr>
+              <w:t># telemetry/metrics.py - Sliding Window Metrics &amp; Jitter Formula</w:t>
+              <w:br/>
+              <w:t>import math</w:t>
+              <w:br/>
+              <w:br/>
+              <w:t>def calculate_jitter(rtt_list):</w:t>
+              <w:br/>
+              <w:t xml:space="preserve">    """Mean absolute difference between consecutive RTTs: 1/(N-1) * sum(|RTT_i - RTT_{i-1}|)"""</w:t>
+              <w:br/>
+              <w:t xml:space="preserve">    if len(rtt_list) &lt; 2: return 0.0</w:t>
+              <w:br/>
+              <w:t xml:space="preserve">    diffs = [abs(rtt_list[i] - rtt_list[i-1]) for i in range(1, len(rtt_list))]</w:t>
+              <w:br/>
+              <w:t xml:space="preserve">    return sum(diffs) / len(diffs)</w:t>
+              <w:br/>
+              <w:br/>
+              <w:t>def calculate_rolling_statistics(rtt_list, total_probes, successful_probes):</w:t>
+              <w:br/>
+              <w:t xml:space="preserve">    loss_pct = ((total_probes - successful_probes) / total_probes * 100) if total_probes &gt; 0 else 0.0</w:t>
+              <w:br/>
+              <w:t xml:space="preserve">    avail_pct = (successful_probes / total_probes * 100) if total_probes &gt; 0 else 0.0</w:t>
+              <w:br/>
+              <w:t xml:space="preserve">    jitter = calculate_jitter(rtt_list)</w:t>
+              <w:br/>
+              <w:t xml:space="preserve">    p95 = sorted(rtt_list)[int((len(rtt_list) - 1) * 0.95)] if rtt_list else 0.0</w:t>
+              <w:br/>
+              <w:t xml:space="preserve">    return {"loss_pct": round(loss_pct, 2), "availability_pct": round(avail_pct, 2),</w:t>
+              <w:br/>
+              <w:t xml:space="preserve">            "jitter_ms": round(jitter, 2), "p95_ms": round(p95, 2)}</w:t>
+            </w:r>
+          </w:p>
+        </w:tc>
+      </w:tr>
+    </w:tbl>
+    <w:p>
+      <w:pPr>
+        <w:spacing w:after="80"/>
+      </w:pPr>
+    </w:p>
+    <w:p>
+      <w:pPr>
+        <w:keepNext/>
+        <w:spacing w:before="100" w:after="40"/>
+      </w:pPr>
+      <w:r>
+        <w:rPr>
+          <w:rFonts w:ascii="Calibri" w:hAnsi="Calibri"/>
+          <w:b/>
+          <w:color w:val="000000"/>
+          <w:sz w:val="18"/>
+        </w:rPr>
+        <w:t>Code Listing: Statistical Anomaly Engine (analytics/anomaly_detector.py)</w:t>
+      </w:r>
+    </w:p>
+    <w:tbl>
+      <w:tblPr>
+        <w:tblW w:type="auto" w:w="0"/>
+        <w:jc w:val="center"/>
+        <w:tblLook w:firstColumn="1" w:firstRow="1" w:lastColumn="0" w:lastRow="0" w:noHBand="0" w:noVBand="1" w:val="04A0"/>
+      </w:tblPr>
+      <w:tblGrid>
+        <w:gridCol w:w="9936"/>
+      </w:tblGrid>
+      <w:tr>
+        <w:tc>
+          <w:tcPr>
+            <w:tcW w:type="dxa" w:w="9936"/>
+            <w:shd w:fill="FFFFFF"/>
+            <w:tcMar>
+              <w:top w:w="80" w:type="dxa"/>
+              <w:bottom w:w="80" w:type="dxa"/>
+              <w:left w:w="120" w:type="dxa"/>
+              <w:right w:w="120" w:type="dxa"/>
+            </w:tcMar>
+            <w:tcBorders>
+              <w:top w:val="single" w:sz="4" w:space="0" w:color="999999"/>
+              <w:left w:val="single" w:sz="12" w:space="0" w:color="000000"/>
+              <w:bottom w:val="single" w:sz="4" w:space="0" w:color="999999"/>
+              <w:right w:val="single" w:sz="4" w:space="0" w:color="999999"/>
+            </w:tcBorders>
+          </w:tcPr>
+          <w:p>
+            <w:pPr>
+              <w:spacing w:before="0" w:after="0" w:line="252" w:lineRule="auto"/>
+            </w:pPr>
+            <w:r>
+              <w:rPr>
+                <w:rFonts w:ascii="Consolas" w:hAnsi="Consolas"/>
+                <w:color w:val="000000"/>
+                <w:sz w:val="16"/>
+              </w:rPr>
+              <w:t># analytics/anomaly_detector.py - Statistical Threshold Checking</w:t>
+              <w:br/>
+              <w:t>class AnomalyDetector:</w:t>
+              <w:br/>
+              <w:t xml:space="preserve">    def __init__(self, rtt_threshold=100.0, loss_threshold=5.0, jitter_threshold=20.0):</w:t>
+              <w:br/>
+              <w:t xml:space="preserve">        self.rtt_threshold = rtt_threshold</w:t>
+              <w:br/>
+              <w:t xml:space="preserve">        self.loss_threshold = loss_threshold</w:t>
+              <w:br/>
+              <w:t xml:space="preserve">        self.jitter_threshold = jitter_threshold</w:t>
+              <w:br/>
+              <w:br/>
+              <w:t xml:space="preserve">    def detect(self, current_metrics):</w:t>
+              <w:br/>
+              <w:t xml:space="preserve">        if current_metrics.get("loss_pct", 0) &gt; self.loss_threshold:</w:t>
+              <w:br/>
+              <w:t xml:space="preserve">            return {"metric": "loss_pct", "reason": "High packet loss detected"}</w:t>
+              <w:br/>
+              <w:t xml:space="preserve">        if current_metrics.get("p95_ms", 0) &gt; self.rtt_threshold:</w:t>
+              <w:br/>
+              <w:t xml:space="preserve">            return {"metric": "p95_ms", "reason": "P95 Latency spike detected"}</w:t>
+              <w:br/>
+              <w:t xml:space="preserve">        if current_metrics.get("jitter_ms", 0) &gt; self.jitter_threshold:</w:t>
+              <w:br/>
+              <w:t xml:space="preserve">            return {"metric": "jitter_ms", "reason": "High jitter/unstable delay detected"}</w:t>
+              <w:br/>
+              <w:t xml:space="preserve">        return None</w:t>
+            </w:r>
+          </w:p>
+        </w:tc>
+      </w:tr>
+    </w:tbl>
+    <w:p>
+      <w:pPr>
+        <w:spacing w:after="80"/>
+      </w:pPr>
     </w:p>
     <w:p>
       <w:pPr>
@@ -1358,7 +1931,7 @@
         <w:rPr>
           <w:rFonts w:ascii="Calibri" w:hAnsi="Calibri"/>
           <w:b/>
-          <w:color w:val="2E6B9E"/>
+          <w:color w:val="000000"/>
           <w:sz w:val="21"/>
         </w:rPr>
         <w:t>3.4 Execution Results (Live Empirical Telemetry)</w:t>
@@ -1371,7 +1944,7 @@
       <w:r>
         <w:rPr>
           <w:rFonts w:ascii="Calibri" w:hAnsi="Calibri"/>
-          <w:color w:val="222222"/>
+          <w:color w:val="000000"/>
           <w:sz w:val="19"/>
         </w:rPr>
         <w:t>The table below shows live empirical network measurements extracted directly from `telemetry.db`:</w:t>
@@ -1383,11 +1956,11 @@
         <w:jc w:val="center"/>
         <w:tblLook w:firstColumn="1" w:firstRow="1" w:lastColumn="0" w:lastRow="0" w:noHBand="0" w:noVBand="1" w:val="04A0"/>
         <w:tblBorders>
-          <w:top w:val="single" w:sz="4" w:space="0" w:color="CBD5E1"/>
+          <w:top w:val="single" w:sz="6" w:space="0" w:color="888888"/>
           <w:left w:val="none"/>
-          <w:bottom w:val="single" w:sz="4" w:space="0" w:color="CBD5E1"/>
+          <w:bottom w:val="single" w:sz="6" w:space="0" w:color="888888"/>
           <w:right w:val="none"/>
-          <w:insideH w:val="single" w:sz="4" w:space="0" w:color="CBD5E1"/>
+          <w:insideH w:val="single" w:sz="6" w:space="0" w:color="888888"/>
           <w:insideV w:val="none"/>
         </w:tblBorders>
       </w:tblPr>
@@ -1403,7 +1976,7 @@
         <w:tc>
           <w:tcPr>
             <w:tcW w:type="dxa" w:w="1584"/>
-            <w:shd w:fill="1B365D"/>
+            <w:shd w:fill="FFFFFF"/>
             <w:tcMar>
               <w:top w:w="120" w:type="dxa"/>
               <w:bottom w:w="120" w:type="dxa"/>
@@ -1420,8 +1993,8 @@
               <w:rPr>
                 <w:rFonts w:ascii="Calibri" w:hAnsi="Calibri"/>
                 <w:b/>
-                <w:color w:val="FFFFFF"/>
-                <w:sz w:val="18"/>
+                <w:color w:val="000000"/>
+                <w:sz w:val="19"/>
               </w:rPr>
               <w:t>Target</w:t>
             </w:r>
@@ -1430,7 +2003,7 @@
         <w:tc>
           <w:tcPr>
             <w:tcW w:type="dxa" w:w="1440"/>
-            <w:shd w:fill="1B365D"/>
+            <w:shd w:fill="FFFFFF"/>
             <w:tcMar>
               <w:top w:w="120" w:type="dxa"/>
               <w:bottom w:w="120" w:type="dxa"/>
@@ -1447,8 +2020,8 @@
               <w:rPr>
                 <w:rFonts w:ascii="Calibri" w:hAnsi="Calibri"/>
                 <w:b/>
-                <w:color w:val="FFFFFF"/>
-                <w:sz w:val="18"/>
+                <w:color w:val="000000"/>
+                <w:sz w:val="19"/>
               </w:rPr>
               <w:t>Protocol</w:t>
             </w:r>
@@ -1457,7 +2030,7 @@
         <w:tc>
           <w:tcPr>
             <w:tcW w:type="dxa" w:w="1584"/>
-            <w:shd w:fill="1B365D"/>
+            <w:shd w:fill="FFFFFF"/>
             <w:tcMar>
               <w:top w:w="120" w:type="dxa"/>
               <w:bottom w:w="120" w:type="dxa"/>
@@ -1474,8 +2047,8 @@
               <w:rPr>
                 <w:rFonts w:ascii="Calibri" w:hAnsi="Calibri"/>
                 <w:b/>
-                <w:color w:val="FFFFFF"/>
-                <w:sz w:val="18"/>
+                <w:color w:val="000000"/>
+                <w:sz w:val="19"/>
               </w:rPr>
               <w:t>Status</w:t>
             </w:r>
@@ -1484,7 +2057,7 @@
         <w:tc>
           <w:tcPr>
             <w:tcW w:type="dxa" w:w="1440"/>
-            <w:shd w:fill="1B365D"/>
+            <w:shd w:fill="FFFFFF"/>
             <w:tcMar>
               <w:top w:w="120" w:type="dxa"/>
               <w:bottom w:w="120" w:type="dxa"/>
@@ -1501,8 +2074,8 @@
               <w:rPr>
                 <w:rFonts w:ascii="Calibri" w:hAnsi="Calibri"/>
                 <w:b/>
-                <w:color w:val="FFFFFF"/>
-                <w:sz w:val="18"/>
+                <w:color w:val="000000"/>
+                <w:sz w:val="19"/>
               </w:rPr>
               <w:t>RTT (ms)</w:t>
             </w:r>
@@ -1511,7 +2084,7 @@
         <w:tc>
           <w:tcPr>
             <w:tcW w:type="dxa" w:w="1008"/>
-            <w:shd w:fill="1B365D"/>
+            <w:shd w:fill="FFFFFF"/>
             <w:tcMar>
               <w:top w:w="120" w:type="dxa"/>
               <w:bottom w:w="120" w:type="dxa"/>
@@ -1528,8 +2101,8 @@
               <w:rPr>
                 <w:rFonts w:ascii="Calibri" w:hAnsi="Calibri"/>
                 <w:b/>
-                <w:color w:val="FFFFFF"/>
-                <w:sz w:val="18"/>
+                <w:color w:val="000000"/>
+                <w:sz w:val="19"/>
               </w:rPr>
               <w:t>TTL</w:t>
             </w:r>
@@ -1538,7 +2111,7 @@
         <w:tc>
           <w:tcPr>
             <w:tcW w:type="dxa" w:w="2880"/>
-            <w:shd w:fill="1B365D"/>
+            <w:shd w:fill="FFFFFF"/>
             <w:tcMar>
               <w:top w:w="120" w:type="dxa"/>
               <w:bottom w:w="120" w:type="dxa"/>
@@ -1555,8 +2128,8 @@
               <w:rPr>
                 <w:rFonts w:ascii="Calibri" w:hAnsi="Calibri"/>
                 <w:b/>
-                <w:color w:val="FFFFFF"/>
-                <w:sz w:val="18"/>
+                <w:color w:val="000000"/>
+                <w:sz w:val="19"/>
               </w:rPr>
               <w:t>Timestamp</w:t>
             </w:r>
@@ -1584,8 +2157,8 @@
               <w:rPr>
                 <w:rFonts w:ascii="Calibri" w:hAnsi="Calibri"/>
                 <w:b/>
-                <w:color w:val="222222"/>
-                <w:sz w:val="17"/>
+                <w:color w:val="000000"/>
+                <w:sz w:val="18"/>
               </w:rPr>
               <w:t>Microsoft</w:t>
             </w:r>
@@ -1610,8 +2183,8 @@
             <w:r>
               <w:rPr>
                 <w:rFonts w:ascii="Calibri" w:hAnsi="Calibri"/>
-                <w:color w:val="222222"/>
-                <w:sz w:val="17"/>
+                <w:color w:val="000000"/>
+                <w:sz w:val="18"/>
               </w:rPr>
               <w:t>ICMP</w:t>
             </w:r>
@@ -1636,8 +2209,8 @@
             <w:r>
               <w:rPr>
                 <w:rFonts w:ascii="Calibri" w:hAnsi="Calibri"/>
-                <w:color w:val="222222"/>
-                <w:sz w:val="17"/>
+                <w:color w:val="000000"/>
+                <w:sz w:val="18"/>
               </w:rPr>
               <w:t>SUCCESS</w:t>
             </w:r>
@@ -1662,8 +2235,8 @@
             <w:r>
               <w:rPr>
                 <w:rFonts w:ascii="Calibri" w:hAnsi="Calibri"/>
-                <w:color w:val="222222"/>
-                <w:sz w:val="17"/>
+                <w:color w:val="000000"/>
+                <w:sz w:val="18"/>
               </w:rPr>
               <w:t>37.37</w:t>
             </w:r>
@@ -1688,8 +2261,8 @@
             <w:r>
               <w:rPr>
                 <w:rFonts w:ascii="Calibri" w:hAnsi="Calibri"/>
-                <w:color w:val="222222"/>
-                <w:sz w:val="17"/>
+                <w:color w:val="000000"/>
+                <w:sz w:val="18"/>
               </w:rPr>
               <w:t>112</w:t>
             </w:r>
@@ -1714,167 +2287,8 @@
             <w:r>
               <w:rPr>
                 <w:rFonts w:ascii="Calibri" w:hAnsi="Calibri"/>
-                <w:color w:val="222222"/>
-                <w:sz w:val="17"/>
-              </w:rPr>
-              <w:t>2026-10-13 15:16:50</w:t>
-            </w:r>
-          </w:p>
-        </w:tc>
-      </w:tr>
-      <w:tr>
-        <w:tc>
-          <w:tcPr>
-            <w:tcW w:type="dxa" w:w="1584"/>
-            <w:shd w:fill="F8FAFC"/>
-            <w:tcMar>
-              <w:top w:w="90" w:type="dxa"/>
-              <w:bottom w:w="90" w:type="dxa"/>
-              <w:left w:w="130" w:type="dxa"/>
-              <w:right w:w="130" w:type="dxa"/>
-            </w:tcMar>
-          </w:tcPr>
-          <w:p>
-            <w:pPr>
-              <w:spacing w:before="0" w:after="0" w:line="252" w:lineRule="auto"/>
-              <w:jc w:val="left"/>
-            </w:pPr>
-            <w:r>
-              <w:rPr>
-                <w:rFonts w:ascii="Calibri" w:hAnsi="Calibri"/>
-                <w:b/>
-                <w:color w:val="222222"/>
-                <w:sz w:val="17"/>
-              </w:rPr>
-              <w:t>Amazon</w:t>
-            </w:r>
-          </w:p>
-        </w:tc>
-        <w:tc>
-          <w:tcPr>
-            <w:tcW w:type="dxa" w:w="1440"/>
-            <w:shd w:fill="F8FAFC"/>
-            <w:tcMar>
-              <w:top w:w="90" w:type="dxa"/>
-              <w:bottom w:w="90" w:type="dxa"/>
-              <w:left w:w="130" w:type="dxa"/>
-              <w:right w:w="130" w:type="dxa"/>
-            </w:tcMar>
-          </w:tcPr>
-          <w:p>
-            <w:pPr>
-              <w:spacing w:before="0" w:after="0" w:line="252" w:lineRule="auto"/>
-              <w:jc w:val="center"/>
-            </w:pPr>
-            <w:r>
-              <w:rPr>
-                <w:rFonts w:ascii="Calibri" w:hAnsi="Calibri"/>
-                <w:color w:val="222222"/>
-                <w:sz w:val="17"/>
-              </w:rPr>
-              <w:t>ICMP</w:t>
-            </w:r>
-          </w:p>
-        </w:tc>
-        <w:tc>
-          <w:tcPr>
-            <w:tcW w:type="dxa" w:w="1584"/>
-            <w:shd w:fill="F8FAFC"/>
-            <w:tcMar>
-              <w:top w:w="90" w:type="dxa"/>
-              <w:bottom w:w="90" w:type="dxa"/>
-              <w:left w:w="130" w:type="dxa"/>
-              <w:right w:w="130" w:type="dxa"/>
-            </w:tcMar>
-          </w:tcPr>
-          <w:p>
-            <w:pPr>
-              <w:spacing w:before="0" w:after="0" w:line="252" w:lineRule="auto"/>
-              <w:jc w:val="center"/>
-            </w:pPr>
-            <w:r>
-              <w:rPr>
-                <w:rFonts w:ascii="Calibri" w:hAnsi="Calibri"/>
-                <w:color w:val="222222"/>
-                <w:sz w:val="17"/>
-              </w:rPr>
-              <w:t>DROP / TIMEOUT</w:t>
-            </w:r>
-          </w:p>
-        </w:tc>
-        <w:tc>
-          <w:tcPr>
-            <w:tcW w:type="dxa" w:w="1440"/>
-            <w:shd w:fill="F8FAFC"/>
-            <w:tcMar>
-              <w:top w:w="90" w:type="dxa"/>
-              <w:bottom w:w="90" w:type="dxa"/>
-              <w:left w:w="130" w:type="dxa"/>
-              <w:right w:w="130" w:type="dxa"/>
-            </w:tcMar>
-          </w:tcPr>
-          <w:p>
-            <w:pPr>
-              <w:spacing w:before="0" w:after="0" w:line="252" w:lineRule="auto"/>
-              <w:jc w:val="center"/>
-            </w:pPr>
-            <w:r>
-              <w:rPr>
-                <w:rFonts w:ascii="Calibri" w:hAnsi="Calibri"/>
-                <w:color w:val="222222"/>
-                <w:sz w:val="17"/>
-              </w:rPr>
-              <w:t>N/A</w:t>
-            </w:r>
-          </w:p>
-        </w:tc>
-        <w:tc>
-          <w:tcPr>
-            <w:tcW w:type="dxa" w:w="1008"/>
-            <w:shd w:fill="F8FAFC"/>
-            <w:tcMar>
-              <w:top w:w="90" w:type="dxa"/>
-              <w:bottom w:w="90" w:type="dxa"/>
-              <w:left w:w="130" w:type="dxa"/>
-              <w:right w:w="130" w:type="dxa"/>
-            </w:tcMar>
-          </w:tcPr>
-          <w:p>
-            <w:pPr>
-              <w:spacing w:before="0" w:after="0" w:line="252" w:lineRule="auto"/>
-              <w:jc w:val="center"/>
-            </w:pPr>
-            <w:r>
-              <w:rPr>
-                <w:rFonts w:ascii="Calibri" w:hAnsi="Calibri"/>
-                <w:color w:val="222222"/>
-                <w:sz w:val="17"/>
-              </w:rPr>
-              <w:t>48</w:t>
-            </w:r>
-          </w:p>
-        </w:tc>
-        <w:tc>
-          <w:tcPr>
-            <w:tcW w:type="dxa" w:w="2880"/>
-            <w:shd w:fill="F8FAFC"/>
-            <w:tcMar>
-              <w:top w:w="90" w:type="dxa"/>
-              <w:bottom w:w="90" w:type="dxa"/>
-              <w:left w:w="130" w:type="dxa"/>
-              <w:right w:w="130" w:type="dxa"/>
-            </w:tcMar>
-          </w:tcPr>
-          <w:p>
-            <w:pPr>
-              <w:spacing w:before="0" w:after="0" w:line="252" w:lineRule="auto"/>
-              <w:jc w:val="center"/>
-            </w:pPr>
-            <w:r>
-              <w:rPr>
-                <w:rFonts w:ascii="Calibri" w:hAnsi="Calibri"/>
-                <w:color w:val="222222"/>
-                <w:sz w:val="17"/>
+                <w:color w:val="000000"/>
+                <w:sz w:val="18"/>
               </w:rPr>
               <w:t>2026-10-13 15:16:50</w:t>
             </w:r>
@@ -1902,10 +2316,10 @@
               <w:rPr>
                 <w:rFonts w:ascii="Calibri" w:hAnsi="Calibri"/>
                 <w:b/>
-                <w:color w:val="222222"/>
-                <w:sz w:val="17"/>
+                <w:color w:val="000000"/>
+                <w:sz w:val="18"/>
               </w:rPr>
-              <w:t>Github</w:t>
+              <w:t>Amazon</w:t>
             </w:r>
           </w:p>
         </w:tc>
@@ -1928,8 +2342,8 @@
             <w:r>
               <w:rPr>
                 <w:rFonts w:ascii="Calibri" w:hAnsi="Calibri"/>
-                <w:color w:val="222222"/>
-                <w:sz w:val="17"/>
+                <w:color w:val="000000"/>
+                <w:sz w:val="18"/>
               </w:rPr>
               <w:t>ICMP</w:t>
             </w:r>
@@ -1954,10 +2368,10 @@
             <w:r>
               <w:rPr>
                 <w:rFonts w:ascii="Calibri" w:hAnsi="Calibri"/>
-                <w:color w:val="222222"/>
-                <w:sz w:val="17"/>
+                <w:color w:val="000000"/>
+                <w:sz w:val="18"/>
               </w:rPr>
-              <w:t>SUCCESS</w:t>
+              <w:t>DROP / TIMEOUT</w:t>
             </w:r>
           </w:p>
         </w:tc>
@@ -1980,10 +2394,10 @@
             <w:r>
               <w:rPr>
                 <w:rFonts w:ascii="Calibri" w:hAnsi="Calibri"/>
-                <w:color w:val="222222"/>
-                <w:sz w:val="17"/>
+                <w:color w:val="000000"/>
+                <w:sz w:val="18"/>
               </w:rPr>
-              <w:t>43.15</w:t>
+              <w:t>N/A</w:t>
             </w:r>
           </w:p>
         </w:tc>
@@ -2006,10 +2420,10 @@
             <w:r>
               <w:rPr>
                 <w:rFonts w:ascii="Calibri" w:hAnsi="Calibri"/>
-                <w:color w:val="222222"/>
-                <w:sz w:val="17"/>
+                <w:color w:val="000000"/>
+                <w:sz w:val="18"/>
               </w:rPr>
-              <w:t>54</w:t>
+              <w:t>48</w:t>
             </w:r>
           </w:p>
         </w:tc>
@@ -2032,167 +2446,8 @@
             <w:r>
               <w:rPr>
                 <w:rFonts w:ascii="Calibri" w:hAnsi="Calibri"/>
-                <w:color w:val="222222"/>
-                <w:sz w:val="17"/>
-              </w:rPr>
-              <w:t>2026-10-13 15:16:50</w:t>
-            </w:r>
-          </w:p>
-        </w:tc>
-      </w:tr>
-      <w:tr>
-        <w:tc>
-          <w:tcPr>
-            <w:tcW w:type="dxa" w:w="1584"/>
-            <w:shd w:fill="F8FAFC"/>
-            <w:tcMar>
-              <w:top w:w="90" w:type="dxa"/>
-              <w:bottom w:w="90" w:type="dxa"/>
-              <w:left w:w="130" w:type="dxa"/>
-              <w:right w:w="130" w:type="dxa"/>
-            </w:tcMar>
-          </w:tcPr>
-          <w:p>
-            <w:pPr>
-              <w:spacing w:before="0" w:after="0" w:line="252" w:lineRule="auto"/>
-              <w:jc w:val="left"/>
-            </w:pPr>
-            <w:r>
-              <w:rPr>
-                <w:rFonts w:ascii="Calibri" w:hAnsi="Calibri"/>
-                <w:b/>
-                <w:color w:val="222222"/>
-                <w:sz w:val="17"/>
-              </w:rPr>
-              <w:t>Cloudflare</w:t>
-            </w:r>
-          </w:p>
-        </w:tc>
-        <w:tc>
-          <w:tcPr>
-            <w:tcW w:type="dxa" w:w="1440"/>
-            <w:shd w:fill="F8FAFC"/>
-            <w:tcMar>
-              <w:top w:w="90" w:type="dxa"/>
-              <w:bottom w:w="90" w:type="dxa"/>
-              <w:left w:w="130" w:type="dxa"/>
-              <w:right w:w="130" w:type="dxa"/>
-            </w:tcMar>
-          </w:tcPr>
-          <w:p>
-            <w:pPr>
-              <w:spacing w:before="0" w:after="0" w:line="252" w:lineRule="auto"/>
-              <w:jc w:val="center"/>
-            </w:pPr>
-            <w:r>
-              <w:rPr>
-                <w:rFonts w:ascii="Calibri" w:hAnsi="Calibri"/>
-                <w:color w:val="222222"/>
-                <w:sz w:val="17"/>
-              </w:rPr>
-              <w:t>ICMP</w:t>
-            </w:r>
-          </w:p>
-        </w:tc>
-        <w:tc>
-          <w:tcPr>
-            <w:tcW w:type="dxa" w:w="1584"/>
-            <w:shd w:fill="F8FAFC"/>
-            <w:tcMar>
-              <w:top w:w="90" w:type="dxa"/>
-              <w:bottom w:w="90" w:type="dxa"/>
-              <w:left w:w="130" w:type="dxa"/>
-              <w:right w:w="130" w:type="dxa"/>
-            </w:tcMar>
-          </w:tcPr>
-          <w:p>
-            <w:pPr>
-              <w:spacing w:before="0" w:after="0" w:line="252" w:lineRule="auto"/>
-              <w:jc w:val="center"/>
-            </w:pPr>
-            <w:r>
-              <w:rPr>
-                <w:rFonts w:ascii="Calibri" w:hAnsi="Calibri"/>
-                <w:color w:val="222222"/>
-                <w:sz w:val="17"/>
-              </w:rPr>
-              <w:t>SUCCESS</w:t>
-            </w:r>
-          </w:p>
-        </w:tc>
-        <w:tc>
-          <w:tcPr>
-            <w:tcW w:type="dxa" w:w="1440"/>
-            <w:shd w:fill="F8FAFC"/>
-            <w:tcMar>
-              <w:top w:w="90" w:type="dxa"/>
-              <w:bottom w:w="90" w:type="dxa"/>
-              <w:left w:w="130" w:type="dxa"/>
-              <w:right w:w="130" w:type="dxa"/>
-            </w:tcMar>
-          </w:tcPr>
-          <w:p>
-            <w:pPr>
-              <w:spacing w:before="0" w:after="0" w:line="252" w:lineRule="auto"/>
-              <w:jc w:val="center"/>
-            </w:pPr>
-            <w:r>
-              <w:rPr>
-                <w:rFonts w:ascii="Calibri" w:hAnsi="Calibri"/>
-                <w:color w:val="222222"/>
-                <w:sz w:val="17"/>
-              </w:rPr>
-              <w:t>26.89</w:t>
-            </w:r>
-          </w:p>
-        </w:tc>
-        <w:tc>
-          <w:tcPr>
-            <w:tcW w:type="dxa" w:w="1008"/>
-            <w:shd w:fill="F8FAFC"/>
-            <w:tcMar>
-              <w:top w:w="90" w:type="dxa"/>
-              <w:bottom w:w="90" w:type="dxa"/>
-              <w:left w:w="130" w:type="dxa"/>
-              <w:right w:w="130" w:type="dxa"/>
-            </w:tcMar>
-          </w:tcPr>
-          <w:p>
-            <w:pPr>
-              <w:spacing w:before="0" w:after="0" w:line="252" w:lineRule="auto"/>
-              <w:jc w:val="center"/>
-            </w:pPr>
-            <w:r>
-              <w:rPr>
-                <w:rFonts w:ascii="Calibri" w:hAnsi="Calibri"/>
-                <w:color w:val="222222"/>
-                <w:sz w:val="17"/>
-              </w:rPr>
-              <w:t>58</w:t>
-            </w:r>
-          </w:p>
-        </w:tc>
-        <w:tc>
-          <w:tcPr>
-            <w:tcW w:type="dxa" w:w="2880"/>
-            <w:shd w:fill="F8FAFC"/>
-            <w:tcMar>
-              <w:top w:w="90" w:type="dxa"/>
-              <w:bottom w:w="90" w:type="dxa"/>
-              <w:left w:w="130" w:type="dxa"/>
-              <w:right w:w="130" w:type="dxa"/>
-            </w:tcMar>
-          </w:tcPr>
-          <w:p>
-            <w:pPr>
-              <w:spacing w:before="0" w:after="0" w:line="252" w:lineRule="auto"/>
-              <w:jc w:val="center"/>
-            </w:pPr>
-            <w:r>
-              <w:rPr>
-                <w:rFonts w:ascii="Calibri" w:hAnsi="Calibri"/>
-                <w:color w:val="222222"/>
-                <w:sz w:val="17"/>
+                <w:color w:val="000000"/>
+                <w:sz w:val="18"/>
               </w:rPr>
               <w:t>2026-10-13 15:16:50</w:t>
             </w:r>
@@ -2220,8 +2475,326 @@
               <w:rPr>
                 <w:rFonts w:ascii="Calibri" w:hAnsi="Calibri"/>
                 <w:b/>
-                <w:color w:val="222222"/>
-                <w:sz w:val="17"/>
+                <w:color w:val="000000"/>
+                <w:sz w:val="18"/>
+              </w:rPr>
+              <w:t>Github</w:t>
+            </w:r>
+          </w:p>
+        </w:tc>
+        <w:tc>
+          <w:tcPr>
+            <w:tcW w:type="dxa" w:w="1440"/>
+            <w:shd w:fill="FFFFFF"/>
+            <w:tcMar>
+              <w:top w:w="90" w:type="dxa"/>
+              <w:bottom w:w="90" w:type="dxa"/>
+              <w:left w:w="130" w:type="dxa"/>
+              <w:right w:w="130" w:type="dxa"/>
+            </w:tcMar>
+          </w:tcPr>
+          <w:p>
+            <w:pPr>
+              <w:spacing w:before="0" w:after="0" w:line="252" w:lineRule="auto"/>
+              <w:jc w:val="center"/>
+            </w:pPr>
+            <w:r>
+              <w:rPr>
+                <w:rFonts w:ascii="Calibri" w:hAnsi="Calibri"/>
+                <w:color w:val="000000"/>
+                <w:sz w:val="18"/>
+              </w:rPr>
+              <w:t>ICMP</w:t>
+            </w:r>
+          </w:p>
+        </w:tc>
+        <w:tc>
+          <w:tcPr>
+            <w:tcW w:type="dxa" w:w="1584"/>
+            <w:shd w:fill="FFFFFF"/>
+            <w:tcMar>
+              <w:top w:w="90" w:type="dxa"/>
+              <w:bottom w:w="90" w:type="dxa"/>
+              <w:left w:w="130" w:type="dxa"/>
+              <w:right w:w="130" w:type="dxa"/>
+            </w:tcMar>
+          </w:tcPr>
+          <w:p>
+            <w:pPr>
+              <w:spacing w:before="0" w:after="0" w:line="252" w:lineRule="auto"/>
+              <w:jc w:val="center"/>
+            </w:pPr>
+            <w:r>
+              <w:rPr>
+                <w:rFonts w:ascii="Calibri" w:hAnsi="Calibri"/>
+                <w:color w:val="000000"/>
+                <w:sz w:val="18"/>
+              </w:rPr>
+              <w:t>SUCCESS</w:t>
+            </w:r>
+          </w:p>
+        </w:tc>
+        <w:tc>
+          <w:tcPr>
+            <w:tcW w:type="dxa" w:w="1440"/>
+            <w:shd w:fill="FFFFFF"/>
+            <w:tcMar>
+              <w:top w:w="90" w:type="dxa"/>
+              <w:bottom w:w="90" w:type="dxa"/>
+              <w:left w:w="130" w:type="dxa"/>
+              <w:right w:w="130" w:type="dxa"/>
+            </w:tcMar>
+          </w:tcPr>
+          <w:p>
+            <w:pPr>
+              <w:spacing w:before="0" w:after="0" w:line="252" w:lineRule="auto"/>
+              <w:jc w:val="center"/>
+            </w:pPr>
+            <w:r>
+              <w:rPr>
+                <w:rFonts w:ascii="Calibri" w:hAnsi="Calibri"/>
+                <w:color w:val="000000"/>
+                <w:sz w:val="18"/>
+              </w:rPr>
+              <w:t>43.15</w:t>
+            </w:r>
+          </w:p>
+        </w:tc>
+        <w:tc>
+          <w:tcPr>
+            <w:tcW w:type="dxa" w:w="1008"/>
+            <w:shd w:fill="FFFFFF"/>
+            <w:tcMar>
+              <w:top w:w="90" w:type="dxa"/>
+              <w:bottom w:w="90" w:type="dxa"/>
+              <w:left w:w="130" w:type="dxa"/>
+              <w:right w:w="130" w:type="dxa"/>
+            </w:tcMar>
+          </w:tcPr>
+          <w:p>
+            <w:pPr>
+              <w:spacing w:before="0" w:after="0" w:line="252" w:lineRule="auto"/>
+              <w:jc w:val="center"/>
+            </w:pPr>
+            <w:r>
+              <w:rPr>
+                <w:rFonts w:ascii="Calibri" w:hAnsi="Calibri"/>
+                <w:color w:val="000000"/>
+                <w:sz w:val="18"/>
+              </w:rPr>
+              <w:t>54</w:t>
+            </w:r>
+          </w:p>
+        </w:tc>
+        <w:tc>
+          <w:tcPr>
+            <w:tcW w:type="dxa" w:w="2880"/>
+            <w:shd w:fill="FFFFFF"/>
+            <w:tcMar>
+              <w:top w:w="90" w:type="dxa"/>
+              <w:bottom w:w="90" w:type="dxa"/>
+              <w:left w:w="130" w:type="dxa"/>
+              <w:right w:w="130" w:type="dxa"/>
+            </w:tcMar>
+          </w:tcPr>
+          <w:p>
+            <w:pPr>
+              <w:spacing w:before="0" w:after="0" w:line="252" w:lineRule="auto"/>
+              <w:jc w:val="center"/>
+            </w:pPr>
+            <w:r>
+              <w:rPr>
+                <w:rFonts w:ascii="Calibri" w:hAnsi="Calibri"/>
+                <w:color w:val="000000"/>
+                <w:sz w:val="18"/>
+              </w:rPr>
+              <w:t>2026-10-13 15:16:50</w:t>
+            </w:r>
+          </w:p>
+        </w:tc>
+      </w:tr>
+      <w:tr>
+        <w:tc>
+          <w:tcPr>
+            <w:tcW w:type="dxa" w:w="1584"/>
+            <w:shd w:fill="FFFFFF"/>
+            <w:tcMar>
+              <w:top w:w="90" w:type="dxa"/>
+              <w:bottom w:w="90" w:type="dxa"/>
+              <w:left w:w="130" w:type="dxa"/>
+              <w:right w:w="130" w:type="dxa"/>
+            </w:tcMar>
+          </w:tcPr>
+          <w:p>
+            <w:pPr>
+              <w:spacing w:before="0" w:after="0" w:line="252" w:lineRule="auto"/>
+              <w:jc w:val="left"/>
+            </w:pPr>
+            <w:r>
+              <w:rPr>
+                <w:rFonts w:ascii="Calibri" w:hAnsi="Calibri"/>
+                <w:b/>
+                <w:color w:val="000000"/>
+                <w:sz w:val="18"/>
+              </w:rPr>
+              <w:t>Cloudflare</w:t>
+            </w:r>
+          </w:p>
+        </w:tc>
+        <w:tc>
+          <w:tcPr>
+            <w:tcW w:type="dxa" w:w="1440"/>
+            <w:shd w:fill="FFFFFF"/>
+            <w:tcMar>
+              <w:top w:w="90" w:type="dxa"/>
+              <w:bottom w:w="90" w:type="dxa"/>
+              <w:left w:w="130" w:type="dxa"/>
+              <w:right w:w="130" w:type="dxa"/>
+            </w:tcMar>
+          </w:tcPr>
+          <w:p>
+            <w:pPr>
+              <w:spacing w:before="0" w:after="0" w:line="252" w:lineRule="auto"/>
+              <w:jc w:val="center"/>
+            </w:pPr>
+            <w:r>
+              <w:rPr>
+                <w:rFonts w:ascii="Calibri" w:hAnsi="Calibri"/>
+                <w:color w:val="000000"/>
+                <w:sz w:val="18"/>
+              </w:rPr>
+              <w:t>ICMP</w:t>
+            </w:r>
+          </w:p>
+        </w:tc>
+        <w:tc>
+          <w:tcPr>
+            <w:tcW w:type="dxa" w:w="1584"/>
+            <w:shd w:fill="FFFFFF"/>
+            <w:tcMar>
+              <w:top w:w="90" w:type="dxa"/>
+              <w:bottom w:w="90" w:type="dxa"/>
+              <w:left w:w="130" w:type="dxa"/>
+              <w:right w:w="130" w:type="dxa"/>
+            </w:tcMar>
+          </w:tcPr>
+          <w:p>
+            <w:pPr>
+              <w:spacing w:before="0" w:after="0" w:line="252" w:lineRule="auto"/>
+              <w:jc w:val="center"/>
+            </w:pPr>
+            <w:r>
+              <w:rPr>
+                <w:rFonts w:ascii="Calibri" w:hAnsi="Calibri"/>
+                <w:color w:val="000000"/>
+                <w:sz w:val="18"/>
+              </w:rPr>
+              <w:t>SUCCESS</w:t>
+            </w:r>
+          </w:p>
+        </w:tc>
+        <w:tc>
+          <w:tcPr>
+            <w:tcW w:type="dxa" w:w="1440"/>
+            <w:shd w:fill="FFFFFF"/>
+            <w:tcMar>
+              <w:top w:w="90" w:type="dxa"/>
+              <w:bottom w:w="90" w:type="dxa"/>
+              <w:left w:w="130" w:type="dxa"/>
+              <w:right w:w="130" w:type="dxa"/>
+            </w:tcMar>
+          </w:tcPr>
+          <w:p>
+            <w:pPr>
+              <w:spacing w:before="0" w:after="0" w:line="252" w:lineRule="auto"/>
+              <w:jc w:val="center"/>
+            </w:pPr>
+            <w:r>
+              <w:rPr>
+                <w:rFonts w:ascii="Calibri" w:hAnsi="Calibri"/>
+                <w:color w:val="000000"/>
+                <w:sz w:val="18"/>
+              </w:rPr>
+              <w:t>26.89</w:t>
+            </w:r>
+          </w:p>
+        </w:tc>
+        <w:tc>
+          <w:tcPr>
+            <w:tcW w:type="dxa" w:w="1008"/>
+            <w:shd w:fill="FFFFFF"/>
+            <w:tcMar>
+              <w:top w:w="90" w:type="dxa"/>
+              <w:bottom w:w="90" w:type="dxa"/>
+              <w:left w:w="130" w:type="dxa"/>
+              <w:right w:w="130" w:type="dxa"/>
+            </w:tcMar>
+          </w:tcPr>
+          <w:p>
+            <w:pPr>
+              <w:spacing w:before="0" w:after="0" w:line="252" w:lineRule="auto"/>
+              <w:jc w:val="center"/>
+            </w:pPr>
+            <w:r>
+              <w:rPr>
+                <w:rFonts w:ascii="Calibri" w:hAnsi="Calibri"/>
+                <w:color w:val="000000"/>
+                <w:sz w:val="18"/>
+              </w:rPr>
+              <w:t>58</w:t>
+            </w:r>
+          </w:p>
+        </w:tc>
+        <w:tc>
+          <w:tcPr>
+            <w:tcW w:type="dxa" w:w="2880"/>
+            <w:shd w:fill="FFFFFF"/>
+            <w:tcMar>
+              <w:top w:w="90" w:type="dxa"/>
+              <w:bottom w:w="90" w:type="dxa"/>
+              <w:left w:w="130" w:type="dxa"/>
+              <w:right w:w="130" w:type="dxa"/>
+            </w:tcMar>
+          </w:tcPr>
+          <w:p>
+            <w:pPr>
+              <w:spacing w:before="0" w:after="0" w:line="252" w:lineRule="auto"/>
+              <w:jc w:val="center"/>
+            </w:pPr>
+            <w:r>
+              <w:rPr>
+                <w:rFonts w:ascii="Calibri" w:hAnsi="Calibri"/>
+                <w:color w:val="000000"/>
+                <w:sz w:val="18"/>
+              </w:rPr>
+              <w:t>2026-10-13 15:16:50</w:t>
+            </w:r>
+          </w:p>
+        </w:tc>
+      </w:tr>
+      <w:tr>
+        <w:tc>
+          <w:tcPr>
+            <w:tcW w:type="dxa" w:w="1584"/>
+            <w:shd w:fill="FFFFFF"/>
+            <w:tcMar>
+              <w:top w:w="90" w:type="dxa"/>
+              <w:bottom w:w="90" w:type="dxa"/>
+              <w:left w:w="130" w:type="dxa"/>
+              <w:right w:w="130" w:type="dxa"/>
+            </w:tcMar>
+          </w:tcPr>
+          <w:p>
+            <w:pPr>
+              <w:spacing w:before="0" w:after="0" w:line="252" w:lineRule="auto"/>
+              <w:jc w:val="left"/>
+            </w:pPr>
+            <w:r>
+              <w:rPr>
+                <w:rFonts w:ascii="Calibri" w:hAnsi="Calibri"/>
+                <w:b/>
+                <w:color w:val="000000"/>
+                <w:sz w:val="18"/>
               </w:rPr>
               <w:t>Google</w:t>
             </w:r>
@@ -2246,8 +2819,8 @@
             <w:r>
               <w:rPr>
                 <w:rFonts w:ascii="Calibri" w:hAnsi="Calibri"/>
-                <w:color w:val="222222"/>
-                <w:sz w:val="17"/>
+                <w:color w:val="000000"/>
+                <w:sz w:val="18"/>
               </w:rPr>
               <w:t>ICMP</w:t>
             </w:r>
@@ -2272,8 +2845,8 @@
             <w:r>
               <w:rPr>
                 <w:rFonts w:ascii="Calibri" w:hAnsi="Calibri"/>
-                <w:color w:val="222222"/>
-                <w:sz w:val="17"/>
+                <w:color w:val="000000"/>
+                <w:sz w:val="18"/>
               </w:rPr>
               <w:t>SUCCESS</w:t>
             </w:r>
@@ -2298,8 +2871,8 @@
             <w:r>
               <w:rPr>
                 <w:rFonts w:ascii="Calibri" w:hAnsi="Calibri"/>
-                <w:color w:val="222222"/>
-                <w:sz w:val="17"/>
+                <w:color w:val="000000"/>
+                <w:sz w:val="18"/>
               </w:rPr>
               <w:t>24.96</w:t>
             </w:r>
@@ -2324,8 +2897,8 @@
             <w:r>
               <w:rPr>
                 <w:rFonts w:ascii="Calibri" w:hAnsi="Calibri"/>
-                <w:color w:val="222222"/>
-                <w:sz w:val="17"/>
+                <w:color w:val="000000"/>
+                <w:sz w:val="18"/>
               </w:rPr>
               <w:t>118</w:t>
             </w:r>
@@ -2350,8 +2923,8 @@
             <w:r>
               <w:rPr>
                 <w:rFonts w:ascii="Calibri" w:hAnsi="Calibri"/>
-                <w:color w:val="222222"/>
-                <w:sz w:val="17"/>
+                <w:color w:val="000000"/>
+                <w:sz w:val="18"/>
               </w:rPr>
               <w:t>2026-10-13 15:16:50</w:t>
             </w:r>
@@ -2373,7 +2946,7 @@
         <w:drawing>
           <wp:inline xmlns:a="http://schemas.openxmlformats.org/drawingml/2006/main" xmlns:pic="http://schemas.openxmlformats.org/drawingml/2006/picture">
             <wp:extent cx="4937760" cy="2128267"/>
-            <wp:docPr id="3" name="Picture 3"/>
+            <wp:docPr id="4" name="Picture 4"/>
             <wp:cNvGraphicFramePr>
               <a:graphicFrameLocks noChangeAspect="1"/>
             </wp:cNvGraphicFramePr>
@@ -2385,7 +2958,7 @@
                     <pic:cNvPicPr/>
                   </pic:nvPicPr>
                   <pic:blipFill>
-                    <a:blip r:embed="rId13"/>
+                    <a:blip r:embed="rId14"/>
                     <a:stretch>
                       <a:fillRect/>
                     </a:stretch>
@@ -2414,10 +2987,10 @@
           <w:rFonts w:ascii="Calibri" w:hAnsi="Calibri"/>
           <w:b/>
           <w:i/>
-          <w:color w:val="64748B"/>
+          <w:color w:val="3C3C3C"/>
           <w:sz w:val="17"/>
         </w:rPr>
-        <w:t>Figure 3: Empirical RTT Latency and Observed TTL Distribution from NetTelemetry Database.</w:t>
+        <w:t>Figure 4: Empirical RTT Latency and Observed TTL Distribution from NetTelemetry Database.</w:t>
       </w:r>
     </w:p>
     <w:p>
@@ -2429,8 +3002,8 @@
         <w:rPr>
           <w:rFonts w:ascii="Calibri" w:hAnsi="Calibri"/>
           <w:b/>
-          <w:color w:val="1B365D"/>
-          <w:sz w:val="25"/>
+          <w:color w:val="000000"/>
+          <w:sz w:val="24"/>
         </w:rPr>
         <w:t>4. Testing and Performance Analysis (Testcases, Connectivity and Performance Evaluation)</w:t>
       </w:r>
@@ -2444,7 +3017,7 @@
         <w:rPr>
           <w:rFonts w:ascii="Calibri" w:hAnsi="Calibri"/>
           <w:b/>
-          <w:color w:val="2E6B9E"/>
+          <w:color w:val="000000"/>
           <w:sz w:val="21"/>
         </w:rPr>
         <w:t>4.1 Testcases &amp; Validation Matrix</w:t>
@@ -2457,10 +3030,10 @@
       <w:r>
         <w:rPr>
           <w:rFonts w:ascii="Calibri" w:hAnsi="Calibri"/>
-          <w:color w:val="222222"/>
+          <w:color w:val="000000"/>
           <w:sz w:val="19"/>
         </w:rPr>
-        <w:t>The test suite covers normal, delayed, and unreachable network conditions. All 37 automated tests passed cleanly (100% success rate):</w:t>
+        <w:t>The test suite covers normal, delayed, and unreachable network conditions. All 37 automated unit and integration tests passed with 100% success rate:</w:t>
       </w:r>
     </w:p>
     <w:tbl>
@@ -2469,11 +3042,11 @@
         <w:jc w:val="center"/>
         <w:tblLook w:firstColumn="1" w:firstRow="1" w:lastColumn="0" w:lastRow="0" w:noHBand="0" w:noVBand="1" w:val="04A0"/>
         <w:tblBorders>
-          <w:top w:val="single" w:sz="4" w:space="0" w:color="CBD5E1"/>
+          <w:top w:val="single" w:sz="6" w:space="0" w:color="888888"/>
           <w:left w:val="none"/>
-          <w:bottom w:val="single" w:sz="4" w:space="0" w:color="CBD5E1"/>
+          <w:bottom w:val="single" w:sz="6" w:space="0" w:color="888888"/>
           <w:right w:val="none"/>
-          <w:insideH w:val="single" w:sz="4" w:space="0" w:color="CBD5E1"/>
+          <w:insideH w:val="single" w:sz="6" w:space="0" w:color="888888"/>
           <w:insideV w:val="none"/>
         </w:tblBorders>
       </w:tblPr>
@@ -2487,7 +3060,7 @@
         <w:tc>
           <w:tcPr>
             <w:tcW w:type="dxa" w:w="1440"/>
-            <w:shd w:fill="1B365D"/>
+            <w:shd w:fill="FFFFFF"/>
             <w:tcMar>
               <w:top w:w="120" w:type="dxa"/>
               <w:bottom w:w="120" w:type="dxa"/>
@@ -2504,8 +3077,8 @@
               <w:rPr>
                 <w:rFonts w:ascii="Calibri" w:hAnsi="Calibri"/>
                 <w:b/>
-                <w:color w:val="FFFFFF"/>
-                <w:sz w:val="18"/>
+                <w:color w:val="000000"/>
+                <w:sz w:val="19"/>
               </w:rPr>
               <w:t>Test ID</w:t>
             </w:r>
@@ -2514,7 +3087,7 @@
         <w:tc>
           <w:tcPr>
             <w:tcW w:type="dxa" w:w="3168"/>
-            <w:shd w:fill="1B365D"/>
+            <w:shd w:fill="FFFFFF"/>
             <w:tcMar>
               <w:top w:w="120" w:type="dxa"/>
               <w:bottom w:w="120" w:type="dxa"/>
@@ -2531,8 +3104,8 @@
               <w:rPr>
                 <w:rFonts w:ascii="Calibri" w:hAnsi="Calibri"/>
                 <w:b/>
-                <w:color w:val="FFFFFF"/>
-                <w:sz w:val="18"/>
+                <w:color w:val="000000"/>
+                <w:sz w:val="19"/>
               </w:rPr>
               <w:t>Test Condition</w:t>
             </w:r>
@@ -2541,7 +3114,7 @@
         <w:tc>
           <w:tcPr>
             <w:tcW w:type="dxa" w:w="4032"/>
-            <w:shd w:fill="1B365D"/>
+            <w:shd w:fill="FFFFFF"/>
             <w:tcMar>
               <w:top w:w="120" w:type="dxa"/>
               <w:bottom w:w="120" w:type="dxa"/>
@@ -2558,8 +3131,8 @@
               <w:rPr>
                 <w:rFonts w:ascii="Calibri" w:hAnsi="Calibri"/>
                 <w:b/>
-                <w:color w:val="FFFFFF"/>
-                <w:sz w:val="18"/>
+                <w:color w:val="000000"/>
+                <w:sz w:val="19"/>
               </w:rPr>
               <w:t>Expected Result</w:t>
             </w:r>
@@ -2568,7 +3141,7 @@
         <w:tc>
           <w:tcPr>
             <w:tcW w:type="dxa" w:w="1296"/>
-            <w:shd w:fill="1B365D"/>
+            <w:shd w:fill="FFFFFF"/>
             <w:tcMar>
               <w:top w:w="120" w:type="dxa"/>
               <w:bottom w:w="120" w:type="dxa"/>
@@ -2585,8 +3158,8 @@
               <w:rPr>
                 <w:rFonts w:ascii="Calibri" w:hAnsi="Calibri"/>
                 <w:b/>
-                <w:color w:val="FFFFFF"/>
-                <w:sz w:val="18"/>
+                <w:color w:val="000000"/>
+                <w:sz w:val="19"/>
               </w:rPr>
               <w:t>Status</w:t>
             </w:r>
@@ -2614,8 +3187,8 @@
               <w:rPr>
                 <w:rFonts w:ascii="Calibri" w:hAnsi="Calibri"/>
                 <w:b/>
-                <w:color w:val="222222"/>
-                <w:sz w:val="17"/>
+                <w:color w:val="000000"/>
+                <w:sz w:val="18"/>
               </w:rPr>
               <w:t>TC-01</w:t>
             </w:r>
@@ -2640,8 +3213,8 @@
             <w:r>
               <w:rPr>
                 <w:rFonts w:ascii="Calibri" w:hAnsi="Calibri"/>
-                <w:color w:val="222222"/>
-                <w:sz w:val="17"/>
+                <w:color w:val="000000"/>
+                <w:sz w:val="18"/>
               </w:rPr>
               <w:t>Reachable Public DNS (8.8.8.8)</w:t>
             </w:r>
@@ -2666,10 +3239,10 @@
             <w:r>
               <w:rPr>
                 <w:rFonts w:ascii="Calibri" w:hAnsi="Calibri"/>
-                <w:color w:val="222222"/>
-                <w:sz w:val="17"/>
+                <w:color w:val="000000"/>
+                <w:sz w:val="18"/>
               </w:rPr>
-              <w:t>Echo Reply received, RTT recorded, TTL extracted</w:t>
+              <w:t>Echo Reply received, RTT &gt; 0ms, TTL extracted</w:t>
             </w:r>
           </w:p>
         </w:tc>
@@ -2692,115 +3265,8 @@
             <w:r>
               <w:rPr>
                 <w:rFonts w:ascii="Calibri" w:hAnsi="Calibri"/>
-                <w:color w:val="222222"/>
-                <w:sz w:val="17"/>
-              </w:rPr>
-              <w:t>PASS</w:t>
-            </w:r>
-          </w:p>
-        </w:tc>
-      </w:tr>
-      <w:tr>
-        <w:tc>
-          <w:tcPr>
-            <w:tcW w:type="dxa" w:w="1440"/>
-            <w:shd w:fill="F8FAFC"/>
-            <w:tcMar>
-              <w:top w:w="90" w:type="dxa"/>
-              <w:bottom w:w="90" w:type="dxa"/>
-              <w:left w:w="130" w:type="dxa"/>
-              <w:right w:w="130" w:type="dxa"/>
-            </w:tcMar>
-          </w:tcPr>
-          <w:p>
-            <w:pPr>
-              <w:spacing w:before="0" w:after="0" w:line="252" w:lineRule="auto"/>
-              <w:jc w:val="center"/>
-            </w:pPr>
-            <w:r>
-              <w:rPr>
-                <w:rFonts w:ascii="Calibri" w:hAnsi="Calibri"/>
-                <w:b/>
-                <w:color w:val="222222"/>
-                <w:sz w:val="17"/>
-              </w:rPr>
-              <w:t>TC-02</w:t>
-            </w:r>
-          </w:p>
-        </w:tc>
-        <w:tc>
-          <w:tcPr>
-            <w:tcW w:type="dxa" w:w="3168"/>
-            <w:shd w:fill="F8FAFC"/>
-            <w:tcMar>
-              <w:top w:w="90" w:type="dxa"/>
-              <w:bottom w:w="90" w:type="dxa"/>
-              <w:left w:w="130" w:type="dxa"/>
-              <w:right w:w="130" w:type="dxa"/>
-            </w:tcMar>
-          </w:tcPr>
-          <w:p>
-            <w:pPr>
-              <w:spacing w:before="0" w:after="0" w:line="252" w:lineRule="auto"/>
-              <w:jc w:val="left"/>
-            </w:pPr>
-            <w:r>
-              <w:rPr>
-                <w:rFonts w:ascii="Calibri" w:hAnsi="Calibri"/>
-                <w:color w:val="222222"/>
-                <w:sz w:val="17"/>
-              </w:rPr>
-              <w:t>Inactive/Unreachable Host</w:t>
-            </w:r>
-          </w:p>
-        </w:tc>
-        <w:tc>
-          <w:tcPr>
-            <w:tcW w:type="dxa" w:w="4032"/>
-            <w:shd w:fill="F8FAFC"/>
-            <w:tcMar>
-              <w:top w:w="90" w:type="dxa"/>
-              <w:bottom w:w="90" w:type="dxa"/>
-              <w:left w:w="130" w:type="dxa"/>
-              <w:right w:w="130" w:type="dxa"/>
-            </w:tcMar>
-          </w:tcPr>
-          <w:p>
-            <w:pPr>
-              <w:spacing w:before="0" w:after="0" w:line="252" w:lineRule="auto"/>
-              <w:jc w:val="center"/>
-            </w:pPr>
-            <w:r>
-              <w:rPr>
-                <w:rFonts w:ascii="Calibri" w:hAnsi="Calibri"/>
-                <w:color w:val="222222"/>
-                <w:sz w:val="17"/>
-              </w:rPr>
-              <w:t>Socket timeout caught cleanly, 100% loss recorded</w:t>
-            </w:r>
-          </w:p>
-        </w:tc>
-        <w:tc>
-          <w:tcPr>
-            <w:tcW w:type="dxa" w:w="1296"/>
-            <w:shd w:fill="F8FAFC"/>
-            <w:tcMar>
-              <w:top w:w="90" w:type="dxa"/>
-              <w:bottom w:w="90" w:type="dxa"/>
-              <w:left w:w="130" w:type="dxa"/>
-              <w:right w:w="130" w:type="dxa"/>
-            </w:tcMar>
-          </w:tcPr>
-          <w:p>
-            <w:pPr>
-              <w:spacing w:before="0" w:after="0" w:line="252" w:lineRule="auto"/>
-              <w:jc w:val="center"/>
-            </w:pPr>
-            <w:r>
-              <w:rPr>
-                <w:rFonts w:ascii="Calibri" w:hAnsi="Calibri"/>
-                <w:color w:val="222222"/>
-                <w:sz w:val="17"/>
+                <w:color w:val="000000"/>
+                <w:sz w:val="18"/>
               </w:rPr>
               <w:t>PASS</w:t>
             </w:r>
@@ -2828,10 +3294,10 @@
               <w:rPr>
                 <w:rFonts w:ascii="Calibri" w:hAnsi="Calibri"/>
                 <w:b/>
-                <w:color w:val="222222"/>
-                <w:sz w:val="17"/>
+                <w:color w:val="000000"/>
+                <w:sz w:val="18"/>
               </w:rPr>
-              <w:t>TC-03</w:t>
+              <w:t>TC-02</w:t>
             </w:r>
           </w:p>
         </w:tc>
@@ -2854,10 +3320,10 @@
             <w:r>
               <w:rPr>
                 <w:rFonts w:ascii="Calibri" w:hAnsi="Calibri"/>
-                <w:color w:val="222222"/>
-                <w:sz w:val="17"/>
+                <w:color w:val="000000"/>
+                <w:sz w:val="18"/>
               </w:rPr>
-              <w:t>TCP Port Check (Port 80/443)</w:t>
+              <w:t>Inactive/Unreachable Host</w:t>
             </w:r>
           </w:p>
         </w:tc>
@@ -2880,10 +3346,10 @@
             <w:r>
               <w:rPr>
                 <w:rFonts w:ascii="Calibri" w:hAnsi="Calibri"/>
-                <w:color w:val="222222"/>
-                <w:sz w:val="17"/>
+                <w:color w:val="000000"/>
+                <w:sz w:val="18"/>
               </w:rPr>
-              <w:t>Socket handshake completes, connect RTT calculated</w:t>
+              <w:t>Socket timeout caught cleanly, loss recorded as failed</w:t>
             </w:r>
           </w:p>
         </w:tc>
@@ -2906,115 +3372,8 @@
             <w:r>
               <w:rPr>
                 <w:rFonts w:ascii="Calibri" w:hAnsi="Calibri"/>
-                <w:color w:val="222222"/>
-                <w:sz w:val="17"/>
-              </w:rPr>
-              <w:t>PASS</w:t>
-            </w:r>
-          </w:p>
-        </w:tc>
-      </w:tr>
-      <w:tr>
-        <w:tc>
-          <w:tcPr>
-            <w:tcW w:type="dxa" w:w="1440"/>
-            <w:shd w:fill="F8FAFC"/>
-            <w:tcMar>
-              <w:top w:w="90" w:type="dxa"/>
-              <w:bottom w:w="90" w:type="dxa"/>
-              <w:left w:w="130" w:type="dxa"/>
-              <w:right w:w="130" w:type="dxa"/>
-            </w:tcMar>
-          </w:tcPr>
-          <w:p>
-            <w:pPr>
-              <w:spacing w:before="0" w:after="0" w:line="252" w:lineRule="auto"/>
-              <w:jc w:val="center"/>
-            </w:pPr>
-            <w:r>
-              <w:rPr>
-                <w:rFonts w:ascii="Calibri" w:hAnsi="Calibri"/>
-                <w:b/>
-                <w:color w:val="222222"/>
-                <w:sz w:val="17"/>
-              </w:rPr>
-              <w:t>TC-04</w:t>
-            </w:r>
-          </w:p>
-        </w:tc>
-        <w:tc>
-          <w:tcPr>
-            <w:tcW w:type="dxa" w:w="3168"/>
-            <w:shd w:fill="F8FAFC"/>
-            <w:tcMar>
-              <w:top w:w="90" w:type="dxa"/>
-              <w:bottom w:w="90" w:type="dxa"/>
-              <w:left w:w="130" w:type="dxa"/>
-              <w:right w:w="130" w:type="dxa"/>
-            </w:tcMar>
-          </w:tcPr>
-          <w:p>
-            <w:pPr>
-              <w:spacing w:before="0" w:after="0" w:line="252" w:lineRule="auto"/>
-              <w:jc w:val="left"/>
-            </w:pPr>
-            <w:r>
-              <w:rPr>
-                <w:rFonts w:ascii="Calibri" w:hAnsi="Calibri"/>
-                <w:color w:val="222222"/>
-                <w:sz w:val="17"/>
-              </w:rPr>
-              <w:t>Jitter &amp; Percentile Math</w:t>
-            </w:r>
-          </w:p>
-        </w:tc>
-        <w:tc>
-          <w:tcPr>
-            <w:tcW w:type="dxa" w:w="4032"/>
-            <w:shd w:fill="F8FAFC"/>
-            <w:tcMar>
-              <w:top w:w="90" w:type="dxa"/>
-              <w:bottom w:w="90" w:type="dxa"/>
-              <w:left w:w="130" w:type="dxa"/>
-              <w:right w:w="130" w:type="dxa"/>
-            </w:tcMar>
-          </w:tcPr>
-          <w:p>
-            <w:pPr>
-              <w:spacing w:before="0" w:after="0" w:line="252" w:lineRule="auto"/>
-              <w:jc w:val="center"/>
-            </w:pPr>
-            <w:r>
-              <w:rPr>
-                <w:rFonts w:ascii="Calibri" w:hAnsi="Calibri"/>
-                <w:color w:val="222222"/>
-                <w:sz w:val="17"/>
-              </w:rPr>
-              <w:t>Computes mean delta of consecutive RTTs correctly</w:t>
-            </w:r>
-          </w:p>
-        </w:tc>
-        <w:tc>
-          <w:tcPr>
-            <w:tcW w:type="dxa" w:w="1296"/>
-            <w:shd w:fill="F8FAFC"/>
-            <w:tcMar>
-              <w:top w:w="90" w:type="dxa"/>
-              <w:bottom w:w="90" w:type="dxa"/>
-              <w:left w:w="130" w:type="dxa"/>
-              <w:right w:w="130" w:type="dxa"/>
-            </w:tcMar>
-          </w:tcPr>
-          <w:p>
-            <w:pPr>
-              <w:spacing w:before="0" w:after="0" w:line="252" w:lineRule="auto"/>
-              <w:jc w:val="center"/>
-            </w:pPr>
-            <w:r>
-              <w:rPr>
-                <w:rFonts w:ascii="Calibri" w:hAnsi="Calibri"/>
-                <w:color w:val="222222"/>
-                <w:sz w:val="17"/>
+                <w:color w:val="000000"/>
+                <w:sz w:val="18"/>
               </w:rPr>
               <w:t>PASS</w:t>
             </w:r>
@@ -3042,8 +3401,222 @@
               <w:rPr>
                 <w:rFonts w:ascii="Calibri" w:hAnsi="Calibri"/>
                 <w:b/>
-                <w:color w:val="222222"/>
-                <w:sz w:val="17"/>
+                <w:color w:val="000000"/>
+                <w:sz w:val="18"/>
+              </w:rPr>
+              <w:t>TC-03</w:t>
+            </w:r>
+          </w:p>
+        </w:tc>
+        <w:tc>
+          <w:tcPr>
+            <w:tcW w:type="dxa" w:w="3168"/>
+            <w:shd w:fill="FFFFFF"/>
+            <w:tcMar>
+              <w:top w:w="90" w:type="dxa"/>
+              <w:bottom w:w="90" w:type="dxa"/>
+              <w:left w:w="130" w:type="dxa"/>
+              <w:right w:w="130" w:type="dxa"/>
+            </w:tcMar>
+          </w:tcPr>
+          <w:p>
+            <w:pPr>
+              <w:spacing w:before="0" w:after="0" w:line="252" w:lineRule="auto"/>
+              <w:jc w:val="left"/>
+            </w:pPr>
+            <w:r>
+              <w:rPr>
+                <w:rFonts w:ascii="Calibri" w:hAnsi="Calibri"/>
+                <w:color w:val="000000"/>
+                <w:sz w:val="18"/>
+              </w:rPr>
+              <w:t>TCP Port Check (Port 80/443)</w:t>
+            </w:r>
+          </w:p>
+        </w:tc>
+        <w:tc>
+          <w:tcPr>
+            <w:tcW w:type="dxa" w:w="4032"/>
+            <w:shd w:fill="FFFFFF"/>
+            <w:tcMar>
+              <w:top w:w="90" w:type="dxa"/>
+              <w:bottom w:w="90" w:type="dxa"/>
+              <w:left w:w="130" w:type="dxa"/>
+              <w:right w:w="130" w:type="dxa"/>
+            </w:tcMar>
+          </w:tcPr>
+          <w:p>
+            <w:pPr>
+              <w:spacing w:before="0" w:after="0" w:line="252" w:lineRule="auto"/>
+              <w:jc w:val="center"/>
+            </w:pPr>
+            <w:r>
+              <w:rPr>
+                <w:rFonts w:ascii="Calibri" w:hAnsi="Calibri"/>
+                <w:color w:val="000000"/>
+                <w:sz w:val="18"/>
+              </w:rPr>
+              <w:t>Socket handshake completes, connect RTT calculated</w:t>
+            </w:r>
+          </w:p>
+        </w:tc>
+        <w:tc>
+          <w:tcPr>
+            <w:tcW w:type="dxa" w:w="1296"/>
+            <w:shd w:fill="FFFFFF"/>
+            <w:tcMar>
+              <w:top w:w="90" w:type="dxa"/>
+              <w:bottom w:w="90" w:type="dxa"/>
+              <w:left w:w="130" w:type="dxa"/>
+              <w:right w:w="130" w:type="dxa"/>
+            </w:tcMar>
+          </w:tcPr>
+          <w:p>
+            <w:pPr>
+              <w:spacing w:before="0" w:after="0" w:line="252" w:lineRule="auto"/>
+              <w:jc w:val="center"/>
+            </w:pPr>
+            <w:r>
+              <w:rPr>
+                <w:rFonts w:ascii="Calibri" w:hAnsi="Calibri"/>
+                <w:color w:val="000000"/>
+                <w:sz w:val="18"/>
+              </w:rPr>
+              <w:t>PASS</w:t>
+            </w:r>
+          </w:p>
+        </w:tc>
+      </w:tr>
+      <w:tr>
+        <w:tc>
+          <w:tcPr>
+            <w:tcW w:type="dxa" w:w="1440"/>
+            <w:shd w:fill="FFFFFF"/>
+            <w:tcMar>
+              <w:top w:w="90" w:type="dxa"/>
+              <w:bottom w:w="90" w:type="dxa"/>
+              <w:left w:w="130" w:type="dxa"/>
+              <w:right w:w="130" w:type="dxa"/>
+            </w:tcMar>
+          </w:tcPr>
+          <w:p>
+            <w:pPr>
+              <w:spacing w:before="0" w:after="0" w:line="252" w:lineRule="auto"/>
+              <w:jc w:val="center"/>
+            </w:pPr>
+            <w:r>
+              <w:rPr>
+                <w:rFonts w:ascii="Calibri" w:hAnsi="Calibri"/>
+                <w:b/>
+                <w:color w:val="000000"/>
+                <w:sz w:val="18"/>
+              </w:rPr>
+              <w:t>TC-04</w:t>
+            </w:r>
+          </w:p>
+        </w:tc>
+        <w:tc>
+          <w:tcPr>
+            <w:tcW w:type="dxa" w:w="3168"/>
+            <w:shd w:fill="FFFFFF"/>
+            <w:tcMar>
+              <w:top w:w="90" w:type="dxa"/>
+              <w:bottom w:w="90" w:type="dxa"/>
+              <w:left w:w="130" w:type="dxa"/>
+              <w:right w:w="130" w:type="dxa"/>
+            </w:tcMar>
+          </w:tcPr>
+          <w:p>
+            <w:pPr>
+              <w:spacing w:before="0" w:after="0" w:line="252" w:lineRule="auto"/>
+              <w:jc w:val="left"/>
+            </w:pPr>
+            <w:r>
+              <w:rPr>
+                <w:rFonts w:ascii="Calibri" w:hAnsi="Calibri"/>
+                <w:color w:val="000000"/>
+                <w:sz w:val="18"/>
+              </w:rPr>
+              <w:t>Jitter &amp; Percentile Math</w:t>
+            </w:r>
+          </w:p>
+        </w:tc>
+        <w:tc>
+          <w:tcPr>
+            <w:tcW w:type="dxa" w:w="4032"/>
+            <w:shd w:fill="FFFFFF"/>
+            <w:tcMar>
+              <w:top w:w="90" w:type="dxa"/>
+              <w:bottom w:w="90" w:type="dxa"/>
+              <w:left w:w="130" w:type="dxa"/>
+              <w:right w:w="130" w:type="dxa"/>
+            </w:tcMar>
+          </w:tcPr>
+          <w:p>
+            <w:pPr>
+              <w:spacing w:before="0" w:after="0" w:line="252" w:lineRule="auto"/>
+              <w:jc w:val="center"/>
+            </w:pPr>
+            <w:r>
+              <w:rPr>
+                <w:rFonts w:ascii="Calibri" w:hAnsi="Calibri"/>
+                <w:color w:val="000000"/>
+                <w:sz w:val="18"/>
+              </w:rPr>
+              <w:t>Computes mean delta of consecutive RTTs accurately</w:t>
+            </w:r>
+          </w:p>
+        </w:tc>
+        <w:tc>
+          <w:tcPr>
+            <w:tcW w:type="dxa" w:w="1296"/>
+            <w:shd w:fill="FFFFFF"/>
+            <w:tcMar>
+              <w:top w:w="90" w:type="dxa"/>
+              <w:bottom w:w="90" w:type="dxa"/>
+              <w:left w:w="130" w:type="dxa"/>
+              <w:right w:w="130" w:type="dxa"/>
+            </w:tcMar>
+          </w:tcPr>
+          <w:p>
+            <w:pPr>
+              <w:spacing w:before="0" w:after="0" w:line="252" w:lineRule="auto"/>
+              <w:jc w:val="center"/>
+            </w:pPr>
+            <w:r>
+              <w:rPr>
+                <w:rFonts w:ascii="Calibri" w:hAnsi="Calibri"/>
+                <w:color w:val="000000"/>
+                <w:sz w:val="18"/>
+              </w:rPr>
+              <w:t>PASS</w:t>
+            </w:r>
+          </w:p>
+        </w:tc>
+      </w:tr>
+      <w:tr>
+        <w:tc>
+          <w:tcPr>
+            <w:tcW w:type="dxa" w:w="1440"/>
+            <w:shd w:fill="FFFFFF"/>
+            <w:tcMar>
+              <w:top w:w="90" w:type="dxa"/>
+              <w:bottom w:w="90" w:type="dxa"/>
+              <w:left w:w="130" w:type="dxa"/>
+              <w:right w:w="130" w:type="dxa"/>
+            </w:tcMar>
+          </w:tcPr>
+          <w:p>
+            <w:pPr>
+              <w:spacing w:before="0" w:after="0" w:line="252" w:lineRule="auto"/>
+              <w:jc w:val="center"/>
+            </w:pPr>
+            <w:r>
+              <w:rPr>
+                <w:rFonts w:ascii="Calibri" w:hAnsi="Calibri"/>
+                <w:b/>
+                <w:color w:val="000000"/>
+                <w:sz w:val="18"/>
               </w:rPr>
               <w:t>TC-05</w:t>
             </w:r>
@@ -3068,8 +3641,8 @@
             <w:r>
               <w:rPr>
                 <w:rFonts w:ascii="Calibri" w:hAnsi="Calibri"/>
-                <w:color w:val="222222"/>
-                <w:sz w:val="17"/>
+                <w:color w:val="000000"/>
+                <w:sz w:val="18"/>
               </w:rPr>
               <w:t>Anomaly Detection Rule</w:t>
             </w:r>
@@ -3094,8 +3667,8 @@
             <w:r>
               <w:rPr>
                 <w:rFonts w:ascii="Calibri" w:hAnsi="Calibri"/>
-                <w:color w:val="222222"/>
-                <w:sz w:val="17"/>
+                <w:color w:val="000000"/>
+                <w:sz w:val="18"/>
               </w:rPr>
               <w:t>Loss &gt; 5% or Jitter &gt; 20ms flags structured anomaly</w:t>
             </w:r>
@@ -3120,8 +3693,8 @@
             <w:r>
               <w:rPr>
                 <w:rFonts w:ascii="Calibri" w:hAnsi="Calibri"/>
-                <w:color w:val="222222"/>
-                <w:sz w:val="17"/>
+                <w:color w:val="000000"/>
+                <w:sz w:val="18"/>
               </w:rPr>
               <w:t>PASS</w:t>
             </w:r>
@@ -3143,7 +3716,7 @@
         <w:rPr>
           <w:rFonts w:ascii="Calibri" w:hAnsi="Calibri"/>
           <w:b/>
-          <w:color w:val="2E6B9E"/>
+          <w:color w:val="000000"/>
           <w:sz w:val="21"/>
         </w:rPr>
         <w:t>4.2 Connectivity &amp; Performance Evaluation</w:t>
@@ -3158,7 +3731,7 @@
         <w:rPr>
           <w:rFonts w:ascii="Calibri" w:hAnsi="Calibri"/>
           <w:b/>
-          <w:color w:val="1B365D"/>
+          <w:color w:val="000000"/>
           <w:sz w:val="18"/>
         </w:rPr>
         <w:t xml:space="preserve">Bandwidth Footprint: </w:t>
@@ -3166,7 +3739,7 @@
       <w:r>
         <w:rPr>
           <w:rFonts w:ascii="Calibri" w:hAnsi="Calibri"/>
-          <w:color w:val="222222"/>
+          <w:color w:val="000000"/>
           <w:sz w:val="18"/>
         </w:rPr>
         <w:t>Each probe is only 60 bytes (20B IP + 8B ICMP + 32B payload). At a 5-second interval, bandwidth overhead is ~96 bps (&lt; 0.0001% of link capacity).</w:t>
@@ -3181,7 +3754,7 @@
         <w:rPr>
           <w:rFonts w:ascii="Calibri" w:hAnsi="Calibri"/>
           <w:b/>
-          <w:color w:val="1B365D"/>
+          <w:color w:val="000000"/>
           <w:sz w:val="18"/>
         </w:rPr>
         <w:t xml:space="preserve">System Efficiency: </w:t>
@@ -3189,7 +3762,7 @@
       <w:r>
         <w:rPr>
           <w:rFonts w:ascii="Calibri" w:hAnsi="Calibri"/>
-          <w:color w:val="222222"/>
+          <w:color w:val="000000"/>
           <w:sz w:val="18"/>
         </w:rPr>
         <w:t>Native Win32 kernel calls execute in &lt; 1.5 ms per probe with &lt; 1.2% CPU and &lt; 45 MB RAM footprint.</w:t>
@@ -3204,7 +3777,7 @@
         <w:rPr>
           <w:rFonts w:ascii="Calibri" w:hAnsi="Calibri"/>
           <w:b/>
-          <w:color w:val="1B365D"/>
+          <w:color w:val="000000"/>
           <w:sz w:val="18"/>
         </w:rPr>
         <w:t xml:space="preserve">Precision &amp; Resilience: </w:t>
@@ -3212,7 +3785,7 @@
       <w:r>
         <w:rPr>
           <w:rFonts w:ascii="Calibri" w:hAnsi="Calibri"/>
-          <w:color w:val="222222"/>
+          <w:color w:val="000000"/>
           <w:sz w:val="18"/>
         </w:rPr>
         <w:t>Provides sub-millisecond timer resolution and handles sudden network disconnections without application crashes.</w:t>
@@ -3227,8 +3800,8 @@
         <w:rPr>
           <w:rFonts w:ascii="Calibri" w:hAnsi="Calibri"/>
           <w:b/>
-          <w:color w:val="1B365D"/>
-          <w:sz w:val="25"/>
+          <w:color w:val="000000"/>
+          <w:sz w:val="24"/>
         </w:rPr>
         <w:t>5. Application (Practical Relevance and Usage of Networking Concept)</w:t>
       </w:r>
@@ -3242,7 +3815,7 @@
         <w:rPr>
           <w:rFonts w:ascii="Calibri" w:hAnsi="Calibri"/>
           <w:b/>
-          <w:color w:val="2E6B9E"/>
+          <w:color w:val="000000"/>
           <w:sz w:val="21"/>
         </w:rPr>
         <w:t>5.1 Practical Relevance in Industry</w:t>
@@ -3257,7 +3830,7 @@
         <w:rPr>
           <w:rFonts w:ascii="Calibri" w:hAnsi="Calibri"/>
           <w:b/>
-          <w:color w:val="1B365D"/>
+          <w:color w:val="000000"/>
           <w:sz w:val="18"/>
         </w:rPr>
         <w:t xml:space="preserve">Enterprise NOC Monitoring: </w:t>
@@ -3265,7 +3838,7 @@
       <w:r>
         <w:rPr>
           <w:rFonts w:ascii="Calibri" w:hAnsi="Calibri"/>
-          <w:color w:val="222222"/>
+          <w:color w:val="000000"/>
           <w:sz w:val="18"/>
         </w:rPr>
         <w:t>Enables network operations engineers to detect branch-office link degradation and router bufferbloat before user complaints.</w:t>
@@ -3280,7 +3853,7 @@
         <w:rPr>
           <w:rFonts w:ascii="Calibri" w:hAnsi="Calibri"/>
           <w:b/>
-          <w:color w:val="1B365D"/>
+          <w:color w:val="000000"/>
           <w:sz w:val="18"/>
         </w:rPr>
         <w:t xml:space="preserve">ISP SLA Auditing: </w:t>
@@ -3288,7 +3861,7 @@
       <w:r>
         <w:rPr>
           <w:rFonts w:ascii="Calibri" w:hAnsi="Calibri"/>
-          <w:color w:val="222222"/>
+          <w:color w:val="000000"/>
           <w:sz w:val="18"/>
         </w:rPr>
         <w:t>Provides continuous, timestamped evidence of uptime, latency, and packet loss to verify ISP Service Level Agreements.</w:t>
@@ -3303,7 +3876,7 @@
         <w:rPr>
           <w:rFonts w:ascii="Calibri" w:hAnsi="Calibri"/>
           <w:b/>
-          <w:color w:val="1B365D"/>
+          <w:color w:val="000000"/>
           <w:sz w:val="18"/>
         </w:rPr>
         <w:t xml:space="preserve">VoIP &amp; Video Quality (QoS): </w:t>
@@ -3311,7 +3884,7 @@
       <w:r>
         <w:rPr>
           <w:rFonts w:ascii="Calibri" w:hAnsi="Calibri"/>
-          <w:color w:val="222222"/>
+          <w:color w:val="000000"/>
           <w:sz w:val="18"/>
         </w:rPr>
         <w:t>Monitors jitter and P95 latency to prevent audio stutter and video buffering in real-time communication.</w:t>
@@ -3326,7 +3899,7 @@
         <w:rPr>
           <w:rFonts w:ascii="Calibri" w:hAnsi="Calibri"/>
           <w:b/>
-          <w:color w:val="1B365D"/>
+          <w:color w:val="000000"/>
           <w:sz w:val="18"/>
         </w:rPr>
         <w:t xml:space="preserve">Cloud Gateway Health: </w:t>
@@ -3334,7 +3907,7 @@
       <w:r>
         <w:rPr>
           <w:rFonts w:ascii="Calibri" w:hAnsi="Calibri"/>
-          <w:color w:val="222222"/>
+          <w:color w:val="000000"/>
           <w:sz w:val="18"/>
         </w:rPr>
         <w:t>Tracks TCP connection times to hybrid-cloud endpoints (AWS, Azure) to detect edge peering bottlenecks.</w:t>
@@ -3349,7 +3922,7 @@
         <w:rPr>
           <w:rFonts w:ascii="Calibri" w:hAnsi="Calibri"/>
           <w:b/>
-          <w:color w:val="2E6B9E"/>
+          <w:color w:val="000000"/>
           <w:sz w:val="21"/>
         </w:rPr>
         <w:t>5.2 Academic Value &amp; Viva Defense Highlights</w:t>
@@ -3362,7 +3935,7 @@
       <w:r>
         <w:rPr>
           <w:rFonts w:ascii="Calibri" w:hAnsi="Calibri"/>
-          <w:color w:val="222222"/>
+          <w:color w:val="000000"/>
           <w:sz w:val="19"/>
         </w:rPr>
         <w:t>• Core Defense: 'NetTelemetry is an active computer networking measurement system. All metrics originate directly from live ICMP, TCP, and UDP packet interactions across the network stack.'</w:t>
@@ -3394,10 +3967,10 @@
     <w:r>
       <w:rPr>
         <w:rFonts w:ascii="Calibri" w:hAnsi="Calibri"/>
-        <w:color w:val="64748B"/>
-        <w:sz w:val="16"/>
-      </w:rPr>
-      <w:t>Computer Networks Laboratory Project • 5th Semester • Department of CSE</w:t>
+        <w:color w:val="3C3C3C"/>
+        <w:sz w:val="17"/>
+      </w:rPr>
+      <w:t>20MSS56 Networks Programming Laboratory • Department of Computer Science &amp; Engineering</w:t>
     </w:r>
   </w:p>
 </w:ftr>
@@ -3413,10 +3986,10 @@
     <w:r>
       <w:rPr>
         <w:rFonts w:ascii="Calibri" w:hAnsi="Calibri"/>
-        <w:color w:val="64748B"/>
-        <w:sz w:val="16"/>
-      </w:rPr>
-      <w:t>NetTelemetry — Concise Project Abstract &amp; Technical Summary</w:t>
+        <w:color w:val="3C3C3C"/>
+        <w:sz w:val="17"/>
+      </w:rPr>
+      <w:t>NetTelemetry — Network Health Monitoring and Performance Telemetry</w:t>
     </w:r>
   </w:p>
 </w:hdr>

</xml_diff>